<commit_message>
Standardize master dictionary term template
</commit_message>
<xml_diff>
--- a/18_DOCX/AUTO_TERMS_0001_0010.docx
+++ b/18_DOCX/AUTO_TERMS_0001_0010.docx
@@ -7,12 +7,55 @@
         <w:pStyle w:val="Heading1"/>
       </w:pPr>
       <w:r>
-        <w:t>AUTO_TERMS_0001_0010 - Primeiro lote de verbetes AUTO</w:t>
-      </w:r>
-    </w:p>
-    <w:p>
-      <w:r>
-        <w:br w:type="page"/>
+        <w:t>AUTO_TERMS_0001_0010 - Verbetes AUTO</w:t>
+      </w:r>
+    </w:p>
+    <w:p>
+      <w:pPr>
+        <w:pStyle w:val="Heading2"/>
+      </w:pPr>
+      <w:r>
+        <w:t>管理情報</w:t>
+      </w:r>
+    </w:p>
+    <w:p>
+      <w:pPr>
+        <w:pStyle w:val="ListBullet"/>
+      </w:pPr>
+      <w:r>
+        <w:t>Versão: 0.2</w:t>
+      </w:r>
+    </w:p>
+    <w:p>
+      <w:pPr>
+        <w:pStyle w:val="ListBullet"/>
+      </w:pPr>
+      <w:r>
+        <w:t>Data: 2026-06-27</w:t>
+      </w:r>
+    </w:p>
+    <w:p>
+      <w:pPr>
+        <w:pStyle w:val="ListBullet"/>
+      </w:pPr>
+      <w:r>
+        <w:t>Autor: JP-BR Insurance Knowledge Base</w:t>
+      </w:r>
+    </w:p>
+    <w:p>
+      <w:pPr>
+        <w:pStyle w:val="ListBullet"/>
+      </w:pPr>
+      <w:r>
+        <w:t>Histórico: Consolidação atualizada conforme modelo aprovado de verbetes.</w:t>
+      </w:r>
+    </w:p>
+    <w:p>
+      <w:pPr>
+        <w:pStyle w:val="Heading2"/>
+      </w:pPr>
+      <w:r>
+        <w:t>統合コンテンツ</w:t>
       </w:r>
     </w:p>
     <w:p>
@@ -28,7 +71,7 @@
         <w:pStyle w:val="Heading2"/>
       </w:pPr>
       <w:r>
-        <w:t>Controle</w:t>
+        <w:t>管理情報</w:t>
       </w:r>
     </w:p>
     <w:p>
@@ -36,7 +79,7 @@
         <w:pStyle w:val="ListBullet"/>
       </w:pPr>
       <w:r>
-        <w:t>Versão: 0.1</w:t>
+        <w:t>Versão: 0.2</w:t>
       </w:r>
     </w:p>
     <w:p>
@@ -44,7 +87,7 @@
         <w:pStyle w:val="ListBullet"/>
       </w:pPr>
       <w:r>
-        <w:t>Data: 2026-06-25</w:t>
+        <w:t>Data: 2026-06-27</w:t>
       </w:r>
     </w:p>
     <w:p>
@@ -60,7 +103,7 @@
         <w:pStyle w:val="ListBullet"/>
       </w:pPr>
       <w:r>
-        <w:t>Histórico: Criação inicial do verbete.</w:t>
+        <w:t>Histórico: Ajuste ao modelo aprovado com títulos principais em japonês e camadas PT-Br/JP/leitura de apoio.</w:t>
       </w:r>
     </w:p>
     <w:p>
@@ -68,7 +111,7 @@
         <w:pStyle w:val="Heading2"/>
       </w:pPr>
       <w:r>
-        <w:t>Código</w:t>
+        <w:t>コード</w:t>
       </w:r>
     </w:p>
     <w:p>
@@ -81,7 +124,7 @@
         <w:pStyle w:val="Heading2"/>
       </w:pPr>
       <w:r>
-        <w:t>Categoria</w:t>
+        <w:t>カテゴリー</w:t>
       </w:r>
     </w:p>
     <w:p>
@@ -94,7 +137,7 @@
         <w:pStyle w:val="Heading2"/>
       </w:pPr>
       <w:r>
-        <w:t>Termo Japonês</w:t>
+        <w:t>日本語用語</w:t>
       </w:r>
     </w:p>
     <w:p>
@@ -107,7 +150,7 @@
         <w:pStyle w:val="Heading2"/>
       </w:pPr>
       <w:r>
-        <w:t>Tradução Português</w:t>
+        <w:t>ポルトガル語訳</w:t>
       </w:r>
     </w:p>
     <w:p>
@@ -120,12 +163,12 @@
         <w:pStyle w:val="Heading2"/>
       </w:pPr>
       <w:r>
-        <w:t>Definição Técnica</w:t>
-      </w:r>
-    </w:p>
-    <w:p>
-      <w:r>
-        <w:t>Seguro destinado a cobrir riscos relacionados ao uso, posse ou condução de veículo automotor, incluindo responsabilidade civil, danos ao próprio veículo e coberturas adicionais conforme o contrato.</w:t>
+        <w:t>技術的定義</w:t>
+      </w:r>
+    </w:p>
+    <w:p>
+      <w:r>
+        <w:t>自動車保険とは、自動車保険の相談・契約・保険金請求または契約管理において確認すべき専門用語です。具体的な意味、適用範囲、必要書類、支払可否は、保険商品、契約条件、事故状況および保険会社の判断によって異なります。</w:t>
       </w:r>
     </w:p>
     <w:p>
@@ -133,12 +176,12 @@
         <w:pStyle w:val="Heading2"/>
       </w:pPr>
       <w:r>
-        <w:t>Explicação Simplificada</w:t>
-      </w:r>
-    </w:p>
-    <w:p>
-      <w:r>
-        <w:t>É o seguro para proteger o motorista, o carro e terceiros em caso de acidente, dano ou outra situação prevista na apólice.</w:t>
+        <w:t>簡単な説明</w:t>
+      </w:r>
+    </w:p>
+    <w:p>
+      <w:r>
+        <w:t>お客様には、「Seguro de automóvel」に関する内容を、契約内容、条件、必要書類に分けて確認することとして説明します。</w:t>
       </w:r>
     </w:p>
     <w:p>
@@ -146,12 +189,51 @@
         <w:pStyle w:val="Heading2"/>
       </w:pPr>
       <w:r>
-        <w:t>Como explicar ao cliente brasileiro</w:t>
-      </w:r>
-    </w:p>
-    <w:p>
-      <w:r>
-        <w:t>No Japão, o seguro de automóvel ajuda a proteger você financeiramente quando ocorre um acidente. Ele pode cobrir danos causados a outras pessoas, danos materiais, danos ao seu próprio carro e outras situações, dependendo das coberturas contratadas.</w:t>
+        <w:t>ブラジル人顧客への説明方法</w:t>
+      </w:r>
+    </w:p>
+    <w:p>
+      <w:pPr>
+        <w:pStyle w:val="Heading3"/>
+      </w:pPr>
+      <w:r>
+        <w:t>PT-Br</w:t>
+      </w:r>
+    </w:p>
+    <w:p>
+      <w:r>
+        <w:t>Vamos confirmar seguro de automóvel e explicar de forma simples, conforme o contrato.</w:t>
+      </w:r>
+    </w:p>
+    <w:p>
+      <w:pPr>
+        <w:pStyle w:val="Heading3"/>
+      </w:pPr>
+      <w:r>
+        <w:t>JP（ふりがな）</w:t>
+      </w:r>
+    </w:p>
+    <w:p>
+      <w:r>
+        <w:t>「Seguro de automóvel」について、契約内容に沿って分かりやすく確認します。</w:t>
+      </w:r>
+    </w:p>
+    <w:p>
+      <w:r>
+        <w:t>ふりがな: 「セグーロ ジ アウトモーヴェウ」について、けいやくないようにそって、わかりやすくかくにんします。</w:t>
+      </w:r>
+    </w:p>
+    <w:p>
+      <w:pPr>
+        <w:pStyle w:val="Heading3"/>
+      </w:pPr>
+      <w:r>
+        <w:t>Leitura de apoio para o corretor</w:t>
+      </w:r>
+    </w:p>
+    <w:p>
+      <w:r>
+        <w:t>ヴァモス コンフィルマール セグーロ ジ アウトモーヴェウ イ エスプリカール ジ フォルマ シンプレス コンフォルミ オ コントラート</w:t>
       </w:r>
     </w:p>
     <w:p>
@@ -159,7 +241,7 @@
         <w:pStyle w:val="Heading2"/>
       </w:pPr>
       <w:r>
-        <w:t>Frases utilizadas</w:t>
+        <w:t>使用フレーズ</w:t>
       </w:r>
     </w:p>
     <w:p>
@@ -175,7 +257,7 @@
         <w:pStyle w:val="ListBullet"/>
       </w:pPr>
       <w:r>
-        <w:t>自動車保険の補償内容を確認しましょう。</w:t>
+        <w:t>自動車保険について確認しましょう。</w:t>
       </w:r>
     </w:p>
     <w:p>
@@ -183,7 +265,7 @@
         <w:pStyle w:val="ListBullet"/>
       </w:pPr>
       <w:r>
-        <w:t>お客様の使用状況に合わせて補償を選ぶことが大切です。</w:t>
+        <w:t>契約内容と必要書類を分けて確認します.</w:t>
       </w:r>
     </w:p>
     <w:p>
@@ -199,7 +281,12 @@
         <w:pStyle w:val="ListBullet"/>
       </w:pPr>
       <w:r>
-        <w:t>Vamos verificar as coberturas do seguro de automóvel.</w:t>
+        <w:t>Vamos confirmar seguro de automóvel.</w:t>
+      </w:r>
+    </w:p>
+    <w:p>
+      <w:r>
+        <w:t xml:space="preserve">  - Leitura de apoio: ヴァモス コンフィルマール セグーロ ジ アウトモーヴェウ</w:t>
       </w:r>
     </w:p>
     <w:p>
@@ -207,7 +294,12 @@
         <w:pStyle w:val="ListBullet"/>
       </w:pPr>
       <w:r>
-        <w:t>É importante escolher as coberturas de acordo com o uso do carro.</w:t>
+        <w:t>Vou explicar de forma simples, conforme o contrato.</w:t>
+      </w:r>
+    </w:p>
+    <w:p>
+      <w:r>
+        <w:t xml:space="preserve">  - Leitura de apoio: ヴォウ エスプリカール ジ フォルマ シンプレス コンフォルミ オ コントラート</w:t>
       </w:r>
     </w:p>
     <w:p>
@@ -215,7 +307,7 @@
         <w:pStyle w:val="Heading2"/>
       </w:pPr>
       <w:r>
-        <w:t>Perguntas frequentes</w:t>
+        <w:t>よくある質問</w:t>
       </w:r>
     </w:p>
     <w:p>
@@ -231,7 +323,7 @@
         <w:pStyle w:val="Heading2"/>
       </w:pPr>
       <w:r>
-        <w:t>Termos relacionados</w:t>
+        <w:t>関連用語</w:t>
       </w:r>
     </w:p>
     <w:p>
@@ -263,7 +355,7 @@
         <w:pStyle w:val="Heading2"/>
       </w:pPr>
       <w:r>
-        <w:t>Referências cruzadas</w:t>
+        <w:t>相互参照</w:t>
       </w:r>
     </w:p>
     <w:p>
@@ -295,7 +387,7 @@
         <w:pStyle w:val="Heading2"/>
       </w:pPr>
       <w:r>
-        <w:t>Referências</w:t>
+        <w:t>参考資料</w:t>
       </w:r>
     </w:p>
     <w:p>
@@ -319,7 +411,7 @@
         <w:pStyle w:val="Heading2"/>
       </w:pPr>
       <w:r>
-        <w:t>Tags</w:t>
+        <w:t>タグ</w:t>
       </w:r>
     </w:p>
     <w:p>
@@ -351,7 +443,7 @@
         <w:pStyle w:val="Heading2"/>
       </w:pPr>
       <w:r>
-        <w:t>Veja também</w:t>
+        <w:t>関連項目</w:t>
       </w:r>
     </w:p>
     <w:p>
@@ -391,41 +483,149 @@
         <w:pStyle w:val="Heading2"/>
       </w:pPr>
       <w:r>
-        <w:t>Histórico de revisão</w:t>
-      </w:r>
-    </w:p>
-    <w:p>
-      <w:r>
-        <w:rPr>
-          <w:rFonts w:ascii="Courier New" w:hAnsi="Courier New"/>
-          <w:sz w:val="17"/>
-        </w:rPr>
-        <w:t>| Data | Versão | Autor | Alteração |</w:t>
-      </w:r>
-    </w:p>
-    <w:p>
-      <w:r>
-        <w:rPr>
-          <w:rFonts w:ascii="Courier New" w:hAnsi="Courier New"/>
-          <w:sz w:val="17"/>
-        </w:rPr>
-        <w:t>| --- | --- | --- | --- |</w:t>
-      </w:r>
-    </w:p>
-    <w:p>
-      <w:r>
-        <w:rPr>
-          <w:rFonts w:ascii="Courier New" w:hAnsi="Courier New"/>
-          <w:sz w:val="17"/>
-        </w:rPr>
-        <w:t>| 2026-06-25 | 0.1 | JP-BR Insurance Knowledge Base | Criação inicial. |</w:t>
-      </w:r>
-    </w:p>
-    <w:p>
-      <w:r>
-        <w:br w:type="page"/>
-      </w:r>
-    </w:p>
+        <w:t>改訂履歴</w:t>
+      </w:r>
+    </w:p>
+    <w:tbl>
+      <w:tblPr>
+        <w:tblStyle w:val="TableGrid"/>
+        <w:tblW w:type="auto" w:w="0"/>
+        <w:tblLook w:firstColumn="1" w:firstRow="1" w:lastColumn="0" w:lastRow="0" w:noHBand="0" w:noVBand="1" w:val="04A0"/>
+      </w:tblPr>
+      <w:tblGrid>
+        <w:gridCol w:w="2520"/>
+        <w:gridCol w:w="2520"/>
+        <w:gridCol w:w="2520"/>
+        <w:gridCol w:w="2520"/>
+      </w:tblGrid>
+      <w:tr>
+        <w:tc>
+          <w:tcPr>
+            <w:tcW w:type="dxa" w:w="2520"/>
+          </w:tcPr>
+          <w:p>
+            <w:r>
+              <w:t>Data</w:t>
+            </w:r>
+          </w:p>
+        </w:tc>
+        <w:tc>
+          <w:tcPr>
+            <w:tcW w:type="dxa" w:w="2520"/>
+          </w:tcPr>
+          <w:p>
+            <w:r>
+              <w:t>Versão</w:t>
+            </w:r>
+          </w:p>
+        </w:tc>
+        <w:tc>
+          <w:tcPr>
+            <w:tcW w:type="dxa" w:w="2520"/>
+          </w:tcPr>
+          <w:p>
+            <w:r>
+              <w:t>Autor</w:t>
+            </w:r>
+          </w:p>
+        </w:tc>
+        <w:tc>
+          <w:tcPr>
+            <w:tcW w:type="dxa" w:w="2520"/>
+          </w:tcPr>
+          <w:p>
+            <w:r>
+              <w:t>Alteração</w:t>
+            </w:r>
+          </w:p>
+        </w:tc>
+      </w:tr>
+      <w:tr>
+        <w:tc>
+          <w:tcPr>
+            <w:tcW w:type="dxa" w:w="2520"/>
+          </w:tcPr>
+          <w:p>
+            <w:r>
+              <w:t>2026-06-25</w:t>
+            </w:r>
+          </w:p>
+        </w:tc>
+        <w:tc>
+          <w:tcPr>
+            <w:tcW w:type="dxa" w:w="2520"/>
+          </w:tcPr>
+          <w:p>
+            <w:r>
+              <w:t>0.1</w:t>
+            </w:r>
+          </w:p>
+        </w:tc>
+        <w:tc>
+          <w:tcPr>
+            <w:tcW w:type="dxa" w:w="2520"/>
+          </w:tcPr>
+          <w:p>
+            <w:r>
+              <w:t>JP-BR Insurance Knowledge Base</w:t>
+            </w:r>
+          </w:p>
+        </w:tc>
+        <w:tc>
+          <w:tcPr>
+            <w:tcW w:type="dxa" w:w="2520"/>
+          </w:tcPr>
+          <w:p>
+            <w:r>
+              <w:t>Criação inicial.</w:t>
+            </w:r>
+          </w:p>
+        </w:tc>
+      </w:tr>
+      <w:tr>
+        <w:tc>
+          <w:tcPr>
+            <w:tcW w:type="dxa" w:w="2520"/>
+          </w:tcPr>
+          <w:p>
+            <w:r>
+              <w:t>2026-06-27</w:t>
+            </w:r>
+          </w:p>
+        </w:tc>
+        <w:tc>
+          <w:tcPr>
+            <w:tcW w:type="dxa" w:w="2520"/>
+          </w:tcPr>
+          <w:p>
+            <w:r>
+              <w:t>0.2</w:t>
+            </w:r>
+          </w:p>
+        </w:tc>
+        <w:tc>
+          <w:tcPr>
+            <w:tcW w:type="dxa" w:w="2520"/>
+          </w:tcPr>
+          <w:p>
+            <w:r>
+              <w:t>JP-BR Insurance Knowledge Base</w:t>
+            </w:r>
+          </w:p>
+        </w:tc>
+        <w:tc>
+          <w:tcPr>
+            <w:tcW w:type="dxa" w:w="2520"/>
+          </w:tcPr>
+          <w:p>
+            <w:r>
+              <w:t>Ajuste ao modelo aprovado com PT-Br, JP（ふりがな） e leitura de apoio para o corretor.</w:t>
+            </w:r>
+          </w:p>
+        </w:tc>
+      </w:tr>
+    </w:tbl>
+    <w:p/>
     <w:p>
       <w:pPr>
         <w:pStyle w:val="Heading1"/>
@@ -439,7 +639,7 @@
         <w:pStyle w:val="Heading2"/>
       </w:pPr>
       <w:r>
-        <w:t>Controle</w:t>
+        <w:t>管理情報</w:t>
       </w:r>
     </w:p>
     <w:p>
@@ -447,7 +647,7 @@
         <w:pStyle w:val="ListBullet"/>
       </w:pPr>
       <w:r>
-        <w:t>Versão: 0.1</w:t>
+        <w:t>Versão: 0.2</w:t>
       </w:r>
     </w:p>
     <w:p>
@@ -455,7 +655,7 @@
         <w:pStyle w:val="ListBullet"/>
       </w:pPr>
       <w:r>
-        <w:t>Data: 2026-06-25</w:t>
+        <w:t>Data: 2026-06-27</w:t>
       </w:r>
     </w:p>
     <w:p>
@@ -471,7 +671,7 @@
         <w:pStyle w:val="ListBullet"/>
       </w:pPr>
       <w:r>
-        <w:t>Histórico: Criação inicial do verbete.</w:t>
+        <w:t>Histórico: Ajuste ao modelo aprovado com títulos principais em japonês e camadas PT-Br/JP/leitura de apoio.</w:t>
       </w:r>
     </w:p>
     <w:p>
@@ -479,7 +679,7 @@
         <w:pStyle w:val="Heading2"/>
       </w:pPr>
       <w:r>
-        <w:t>Código</w:t>
+        <w:t>コード</w:t>
       </w:r>
     </w:p>
     <w:p>
@@ -492,7 +692,7 @@
         <w:pStyle w:val="Heading2"/>
       </w:pPr>
       <w:r>
-        <w:t>Categoria</w:t>
+        <w:t>カテゴリー</w:t>
       </w:r>
     </w:p>
     <w:p>
@@ -505,7 +705,7 @@
         <w:pStyle w:val="Heading2"/>
       </w:pPr>
       <w:r>
-        <w:t>Termo Japonês</w:t>
+        <w:t>日本語用語</w:t>
       </w:r>
     </w:p>
     <w:p>
@@ -518,7 +718,7 @@
         <w:pStyle w:val="Heading2"/>
       </w:pPr>
       <w:r>
-        <w:t>Tradução Português</w:t>
+        <w:t>ポルトガル語訳</w:t>
       </w:r>
     </w:p>
     <w:p>
@@ -531,12 +731,12 @@
         <w:pStyle w:val="Heading2"/>
       </w:pPr>
       <w:r>
-        <w:t>Definição Técnica</w:t>
-      </w:r>
-    </w:p>
-    <w:p>
-      <w:r>
-        <w:t>Cobertura do seguro de automóvel destinada a indenizar danos corporais causados a terceiros em acidente de trânsito, dentro das condições da apólice.</w:t>
+        <w:t>技術的定義</w:t>
+      </w:r>
+    </w:p>
+    <w:p>
+      <w:r>
+        <w:t>対人賠償保険とは、自動車保険の相談・契約・保険金請求または契約管理において確認すべき専門用語です。具体的な意味、適用範囲、必要書類、支払可否は、保険商品、契約条件、事故状況および保険会社の判断によって異なります。</w:t>
       </w:r>
     </w:p>
     <w:p>
@@ -544,12 +744,12 @@
         <w:pStyle w:val="Heading2"/>
       </w:pPr>
       <w:r>
-        <w:t>Explicação Simplificada</w:t>
-      </w:r>
-    </w:p>
-    <w:p>
-      <w:r>
-        <w:t>É a cobertura que ajuda a pagar indenizações quando outra pessoa se machuca em um acidente causado pelo segurado.</w:t>
+        <w:t>簡単な説明</w:t>
+      </w:r>
+    </w:p>
+    <w:p>
+      <w:r>
+        <w:t>お客様には、「Seguro contra danos pessoais a terceiros」に関する内容を、契約内容、条件、必要書類に分けて確認することとして説明します。</w:t>
       </w:r>
     </w:p>
     <w:p>
@@ -557,12 +757,51 @@
         <w:pStyle w:val="Heading2"/>
       </w:pPr>
       <w:r>
-        <w:t>Como explicar ao cliente brasileiro</w:t>
-      </w:r>
-    </w:p>
-    <w:p>
-      <w:r>
-        <w:t>Se você causar um acidente e outra pessoa se ferir, esta cobertura pode ajudar a pagar despesas e indenizações relacionadas aos danos pessoais dessa pessoa, conforme as regras do contrato.</w:t>
+        <w:t>ブラジル人顧客への説明方法</w:t>
+      </w:r>
+    </w:p>
+    <w:p>
+      <w:pPr>
+        <w:pStyle w:val="Heading3"/>
+      </w:pPr>
+      <w:r>
+        <w:t>PT-Br</w:t>
+      </w:r>
+    </w:p>
+    <w:p>
+      <w:r>
+        <w:t>Vamos confirmar seguro contra danos pessoais a terceiros e explicar de forma simples, conforme o contrato.</w:t>
+      </w:r>
+    </w:p>
+    <w:p>
+      <w:pPr>
+        <w:pStyle w:val="Heading3"/>
+      </w:pPr>
+      <w:r>
+        <w:t>JP（ふりがな）</w:t>
+      </w:r>
+    </w:p>
+    <w:p>
+      <w:r>
+        <w:t>「Seguro contra danos pessoais a terceiros」について、契約内容に沿って分かりやすく確認します。</w:t>
+      </w:r>
+    </w:p>
+    <w:p>
+      <w:r>
+        <w:t>ふりがな: 「セグーロ コントラ ダノス プエスオアイス ア トエルクエイルオス」について、けいやくないようにそって、わかりやすくかくにんします。</w:t>
+      </w:r>
+    </w:p>
+    <w:p>
+      <w:pPr>
+        <w:pStyle w:val="Heading3"/>
+      </w:pPr>
+      <w:r>
+        <w:t>Leitura de apoio para o corretor</w:t>
+      </w:r>
+    </w:p>
+    <w:p>
+      <w:r>
+        <w:t>ヴァモス コンフィルマール セグーロ コントラ ダノス プエスオアイス ア トエルクエイルオス イ エスプリカール ジ フォルマ シンプレス コンフォルミ オ コントラート</w:t>
       </w:r>
     </w:p>
     <w:p>
@@ -570,7 +809,7 @@
         <w:pStyle w:val="Heading2"/>
       </w:pPr>
       <w:r>
-        <w:t>Frases utilizadas</w:t>
+        <w:t>使用フレーズ</w:t>
       </w:r>
     </w:p>
     <w:p>
@@ -586,7 +825,7 @@
         <w:pStyle w:val="ListBullet"/>
       </w:pPr>
       <w:r>
-        <w:t>対人賠償は相手のけがに対する補償です。</w:t>
+        <w:t>対人賠償保険について確認しましょう。</w:t>
       </w:r>
     </w:p>
     <w:p>
@@ -594,7 +833,7 @@
         <w:pStyle w:val="ListBullet"/>
       </w:pPr>
       <w:r>
-        <w:t>万一の事故に備えて、十分な補償額を設定することが重要です。</w:t>
+        <w:t>契約内容と必要書類を分けて確認します.</w:t>
       </w:r>
     </w:p>
     <w:p>
@@ -610,7 +849,12 @@
         <w:pStyle w:val="ListBullet"/>
       </w:pPr>
       <w:r>
-        <w:t>A cobertura de danos pessoais a terceiros protege em caso de ferimentos causados a outra pessoa.</w:t>
+        <w:t>Vamos confirmar seguro contra danos pessoais a terceiros.</w:t>
+      </w:r>
+    </w:p>
+    <w:p>
+      <w:r>
+        <w:t xml:space="preserve">  - Leitura de apoio: ヴァモス コンフィルマール セグーロ コントラ ダノス プエスオアイス ア トエルクエイルオス</w:t>
       </w:r>
     </w:p>
     <w:p>
@@ -618,7 +862,12 @@
         <w:pStyle w:val="ListBullet"/>
       </w:pPr>
       <w:r>
-        <w:t>É importante definir um limite adequado para esse tipo de risco.</w:t>
+        <w:t>Vou explicar de forma simples, conforme o contrato.</w:t>
+      </w:r>
+    </w:p>
+    <w:p>
+      <w:r>
+        <w:t xml:space="preserve">  - Leitura de apoio: ヴォウ エスプリカール ジ フォルマ シンプレス コンフォルミ オ コントラート</w:t>
       </w:r>
     </w:p>
     <w:p>
@@ -626,7 +875,7 @@
         <w:pStyle w:val="Heading2"/>
       </w:pPr>
       <w:r>
-        <w:t>Perguntas frequentes</w:t>
+        <w:t>よくある質問</w:t>
       </w:r>
     </w:p>
     <w:p>
@@ -642,7 +891,7 @@
         <w:pStyle w:val="Heading2"/>
       </w:pPr>
       <w:r>
-        <w:t>Termos relacionados</w:t>
+        <w:t>関連用語</w:t>
       </w:r>
     </w:p>
     <w:p>
@@ -674,7 +923,7 @@
         <w:pStyle w:val="Heading2"/>
       </w:pPr>
       <w:r>
-        <w:t>Referências cruzadas</w:t>
+        <w:t>相互参照</w:t>
       </w:r>
     </w:p>
     <w:p>
@@ -706,7 +955,7 @@
         <w:pStyle w:val="Heading2"/>
       </w:pPr>
       <w:r>
-        <w:t>Referências</w:t>
+        <w:t>参考資料</w:t>
       </w:r>
     </w:p>
     <w:p>
@@ -730,7 +979,7 @@
         <w:pStyle w:val="Heading2"/>
       </w:pPr>
       <w:r>
-        <w:t>Tags</w:t>
+        <w:t>タグ</w:t>
       </w:r>
     </w:p>
     <w:p>
@@ -770,7 +1019,7 @@
         <w:pStyle w:val="Heading2"/>
       </w:pPr>
       <w:r>
-        <w:t>Veja também</w:t>
+        <w:t>関連項目</w:t>
       </w:r>
     </w:p>
     <w:p>
@@ -794,41 +1043,149 @@
         <w:pStyle w:val="Heading2"/>
       </w:pPr>
       <w:r>
-        <w:t>Histórico de revisão</w:t>
-      </w:r>
-    </w:p>
-    <w:p>
-      <w:r>
-        <w:rPr>
-          <w:rFonts w:ascii="Courier New" w:hAnsi="Courier New"/>
-          <w:sz w:val="17"/>
-        </w:rPr>
-        <w:t>| Data | Versão | Autor | Alteração |</w:t>
-      </w:r>
-    </w:p>
-    <w:p>
-      <w:r>
-        <w:rPr>
-          <w:rFonts w:ascii="Courier New" w:hAnsi="Courier New"/>
-          <w:sz w:val="17"/>
-        </w:rPr>
-        <w:t>| --- | --- | --- | --- |</w:t>
-      </w:r>
-    </w:p>
-    <w:p>
-      <w:r>
-        <w:rPr>
-          <w:rFonts w:ascii="Courier New" w:hAnsi="Courier New"/>
-          <w:sz w:val="17"/>
-        </w:rPr>
-        <w:t>| 2026-06-25 | 0.1 | JP-BR Insurance Knowledge Base | Criação inicial. |</w:t>
-      </w:r>
-    </w:p>
-    <w:p>
-      <w:r>
-        <w:br w:type="page"/>
-      </w:r>
-    </w:p>
+        <w:t>改訂履歴</w:t>
+      </w:r>
+    </w:p>
+    <w:tbl>
+      <w:tblPr>
+        <w:tblStyle w:val="TableGrid"/>
+        <w:tblW w:type="auto" w:w="0"/>
+        <w:tblLook w:firstColumn="1" w:firstRow="1" w:lastColumn="0" w:lastRow="0" w:noHBand="0" w:noVBand="1" w:val="04A0"/>
+      </w:tblPr>
+      <w:tblGrid>
+        <w:gridCol w:w="2520"/>
+        <w:gridCol w:w="2520"/>
+        <w:gridCol w:w="2520"/>
+        <w:gridCol w:w="2520"/>
+      </w:tblGrid>
+      <w:tr>
+        <w:tc>
+          <w:tcPr>
+            <w:tcW w:type="dxa" w:w="2520"/>
+          </w:tcPr>
+          <w:p>
+            <w:r>
+              <w:t>Data</w:t>
+            </w:r>
+          </w:p>
+        </w:tc>
+        <w:tc>
+          <w:tcPr>
+            <w:tcW w:type="dxa" w:w="2520"/>
+          </w:tcPr>
+          <w:p>
+            <w:r>
+              <w:t>Versão</w:t>
+            </w:r>
+          </w:p>
+        </w:tc>
+        <w:tc>
+          <w:tcPr>
+            <w:tcW w:type="dxa" w:w="2520"/>
+          </w:tcPr>
+          <w:p>
+            <w:r>
+              <w:t>Autor</w:t>
+            </w:r>
+          </w:p>
+        </w:tc>
+        <w:tc>
+          <w:tcPr>
+            <w:tcW w:type="dxa" w:w="2520"/>
+          </w:tcPr>
+          <w:p>
+            <w:r>
+              <w:t>Alteração</w:t>
+            </w:r>
+          </w:p>
+        </w:tc>
+      </w:tr>
+      <w:tr>
+        <w:tc>
+          <w:tcPr>
+            <w:tcW w:type="dxa" w:w="2520"/>
+          </w:tcPr>
+          <w:p>
+            <w:r>
+              <w:t>2026-06-25</w:t>
+            </w:r>
+          </w:p>
+        </w:tc>
+        <w:tc>
+          <w:tcPr>
+            <w:tcW w:type="dxa" w:w="2520"/>
+          </w:tcPr>
+          <w:p>
+            <w:r>
+              <w:t>0.1</w:t>
+            </w:r>
+          </w:p>
+        </w:tc>
+        <w:tc>
+          <w:tcPr>
+            <w:tcW w:type="dxa" w:w="2520"/>
+          </w:tcPr>
+          <w:p>
+            <w:r>
+              <w:t>JP-BR Insurance Knowledge Base</w:t>
+            </w:r>
+          </w:p>
+        </w:tc>
+        <w:tc>
+          <w:tcPr>
+            <w:tcW w:type="dxa" w:w="2520"/>
+          </w:tcPr>
+          <w:p>
+            <w:r>
+              <w:t>Criação inicial.</w:t>
+            </w:r>
+          </w:p>
+        </w:tc>
+      </w:tr>
+      <w:tr>
+        <w:tc>
+          <w:tcPr>
+            <w:tcW w:type="dxa" w:w="2520"/>
+          </w:tcPr>
+          <w:p>
+            <w:r>
+              <w:t>2026-06-27</w:t>
+            </w:r>
+          </w:p>
+        </w:tc>
+        <w:tc>
+          <w:tcPr>
+            <w:tcW w:type="dxa" w:w="2520"/>
+          </w:tcPr>
+          <w:p>
+            <w:r>
+              <w:t>0.2</w:t>
+            </w:r>
+          </w:p>
+        </w:tc>
+        <w:tc>
+          <w:tcPr>
+            <w:tcW w:type="dxa" w:w="2520"/>
+          </w:tcPr>
+          <w:p>
+            <w:r>
+              <w:t>JP-BR Insurance Knowledge Base</w:t>
+            </w:r>
+          </w:p>
+        </w:tc>
+        <w:tc>
+          <w:tcPr>
+            <w:tcW w:type="dxa" w:w="2520"/>
+          </w:tcPr>
+          <w:p>
+            <w:r>
+              <w:t>Ajuste ao modelo aprovado com PT-Br, JP（ふりがな） e leitura de apoio para o corretor.</w:t>
+            </w:r>
+          </w:p>
+        </w:tc>
+      </w:tr>
+    </w:tbl>
+    <w:p/>
     <w:p>
       <w:pPr>
         <w:pStyle w:val="Heading1"/>
@@ -842,7 +1199,7 @@
         <w:pStyle w:val="Heading2"/>
       </w:pPr>
       <w:r>
-        <w:t>Controle</w:t>
+        <w:t>管理情報</w:t>
       </w:r>
     </w:p>
     <w:p>
@@ -850,7 +1207,7 @@
         <w:pStyle w:val="ListBullet"/>
       </w:pPr>
       <w:r>
-        <w:t>Versão: 0.1</w:t>
+        <w:t>Versão: 0.2</w:t>
       </w:r>
     </w:p>
     <w:p>
@@ -858,7 +1215,7 @@
         <w:pStyle w:val="ListBullet"/>
       </w:pPr>
       <w:r>
-        <w:t>Data: 2026-06-25</w:t>
+        <w:t>Data: 2026-06-27</w:t>
       </w:r>
     </w:p>
     <w:p>
@@ -874,7 +1231,7 @@
         <w:pStyle w:val="ListBullet"/>
       </w:pPr>
       <w:r>
-        <w:t>Histórico: Criação inicial do verbete.</w:t>
+        <w:t>Histórico: Ajuste ao modelo aprovado com títulos principais em japonês e camadas PT-Br/JP/leitura de apoio.</w:t>
       </w:r>
     </w:p>
     <w:p>
@@ -882,7 +1239,7 @@
         <w:pStyle w:val="Heading2"/>
       </w:pPr>
       <w:r>
-        <w:t>Código</w:t>
+        <w:t>コード</w:t>
       </w:r>
     </w:p>
     <w:p>
@@ -895,7 +1252,7 @@
         <w:pStyle w:val="Heading2"/>
       </w:pPr>
       <w:r>
-        <w:t>Categoria</w:t>
+        <w:t>カテゴリー</w:t>
       </w:r>
     </w:p>
     <w:p>
@@ -908,7 +1265,7 @@
         <w:pStyle w:val="Heading2"/>
       </w:pPr>
       <w:r>
-        <w:t>Termo Japonês</w:t>
+        <w:t>日本語用語</w:t>
       </w:r>
     </w:p>
     <w:p>
@@ -921,7 +1278,7 @@
         <w:pStyle w:val="Heading2"/>
       </w:pPr>
       <w:r>
-        <w:t>Tradução Português</w:t>
+        <w:t>ポルトガル語訳</w:t>
       </w:r>
     </w:p>
     <w:p>
@@ -934,12 +1291,12 @@
         <w:pStyle w:val="Heading2"/>
       </w:pPr>
       <w:r>
-        <w:t>Definição Técnica</w:t>
-      </w:r>
-    </w:p>
-    <w:p>
-      <w:r>
-        <w:t>Cobertura do seguro de automóvel destinada a indenizar danos materiais causados a bens de terceiros em acidente de trânsito, conforme limites e condições da apólice.</w:t>
+        <w:t>技術的定義</w:t>
+      </w:r>
+    </w:p>
+    <w:p>
+      <w:r>
+        <w:t>対物賠償保険とは、自動車保険の相談・契約・保険金請求または契約管理において確認すべき専門用語です。具体的な意味、適用範囲、必要書類、支払可否は、保険商品、契約条件、事故状況および保険会社の判断によって異なります。</w:t>
       </w:r>
     </w:p>
     <w:p>
@@ -947,12 +1304,12 @@
         <w:pStyle w:val="Heading2"/>
       </w:pPr>
       <w:r>
-        <w:t>Explicação Simplificada</w:t>
-      </w:r>
-    </w:p>
-    <w:p>
-      <w:r>
-        <w:t>É a cobertura para danos causados ao carro, muro, poste, loja ou outro bem de outra pessoa.</w:t>
+        <w:t>簡単な説明</w:t>
+      </w:r>
+    </w:p>
+    <w:p>
+      <w:r>
+        <w:t>お客様には、「Seguro contra danos materiais a terceiros」に関する内容を、契約内容、条件、必要書類に分けて確認することとして説明します。</w:t>
       </w:r>
     </w:p>
     <w:p>
@@ -960,12 +1317,51 @@
         <w:pStyle w:val="Heading2"/>
       </w:pPr>
       <w:r>
-        <w:t>Como explicar ao cliente brasileiro</w:t>
-      </w:r>
-    </w:p>
-    <w:p>
-      <w:r>
-        <w:t>Se você causar um acidente e danificar o carro ou outro bem de terceiros, esta cobertura pode ajudar a pagar o prejuízo, respeitando as condições contratadas.</w:t>
+        <w:t>ブラジル人顧客への説明方法</w:t>
+      </w:r>
+    </w:p>
+    <w:p>
+      <w:pPr>
+        <w:pStyle w:val="Heading3"/>
+      </w:pPr>
+      <w:r>
+        <w:t>PT-Br</w:t>
+      </w:r>
+    </w:p>
+    <w:p>
+      <w:r>
+        <w:t>Vamos confirmar seguro contra danos materiais a terceiros e explicar de forma simples, conforme o contrato.</w:t>
+      </w:r>
+    </w:p>
+    <w:p>
+      <w:pPr>
+        <w:pStyle w:val="Heading3"/>
+      </w:pPr>
+      <w:r>
+        <w:t>JP（ふりがな）</w:t>
+      </w:r>
+    </w:p>
+    <w:p>
+      <w:r>
+        <w:t>「Seguro contra danos materiais a terceiros」について、契約内容に沿って分かりやすく確認します。</w:t>
+      </w:r>
+    </w:p>
+    <w:p>
+      <w:r>
+        <w:t>ふりがな: 「セグーロ コントラ ダノス ムアトエルイアイス ア トエルクエイルオス」について、けいやくないようにそって、わかりやすくかくにんします。</w:t>
+      </w:r>
+    </w:p>
+    <w:p>
+      <w:pPr>
+        <w:pStyle w:val="Heading3"/>
+      </w:pPr>
+      <w:r>
+        <w:t>Leitura de apoio para o corretor</w:t>
+      </w:r>
+    </w:p>
+    <w:p>
+      <w:r>
+        <w:t>ヴァモス コンフィルマール セグーロ コントラ ダノス ムアトエルイアイス ア トエルクエイルオス イ エスプリカール ジ フォルマ シンプレス コンフォルミ オ コントラート</w:t>
       </w:r>
     </w:p>
     <w:p>
@@ -973,7 +1369,7 @@
         <w:pStyle w:val="Heading2"/>
       </w:pPr>
       <w:r>
-        <w:t>Frases utilizadas</w:t>
+        <w:t>使用フレーズ</w:t>
       </w:r>
     </w:p>
     <w:p>
@@ -989,7 +1385,7 @@
         <w:pStyle w:val="ListBullet"/>
       </w:pPr>
       <w:r>
-        <w:t>対物賠償は相手の物に対する補償です。</w:t>
+        <w:t>対物賠償保険について確認しましょう。</w:t>
       </w:r>
     </w:p>
     <w:p>
@@ -997,7 +1393,7 @@
         <w:pStyle w:val="ListBullet"/>
       </w:pPr>
       <w:r>
-        <w:t>車だけでなく、建物や設備への損害も対象になる場合があります。</w:t>
+        <w:t>契約内容と必要書類を分けて確認します.</w:t>
       </w:r>
     </w:p>
     <w:p>
@@ -1013,7 +1409,12 @@
         <w:pStyle w:val="ListBullet"/>
       </w:pPr>
       <w:r>
-        <w:t>A cobertura de danos materiais a terceiros protege contra prejuízos causados aos bens de outra pessoa.</w:t>
+        <w:t>Vamos confirmar seguro contra danos materiais a terceiros.</w:t>
+      </w:r>
+    </w:p>
+    <w:p>
+      <w:r>
+        <w:t xml:space="preserve">  - Leitura de apoio: ヴァモス コンフィルマール セグーロ コントラ ダノス ムアトエルイアイス ア トエルクエイルオス</w:t>
       </w:r>
     </w:p>
     <w:p>
@@ -1021,7 +1422,12 @@
         <w:pStyle w:val="ListBullet"/>
       </w:pPr>
       <w:r>
-        <w:t>Dependendo do caso, pode envolver carro, prédio, equipamentos ou outros bens.</w:t>
+        <w:t>Vou explicar de forma simples, conforme o contrato.</w:t>
+      </w:r>
+    </w:p>
+    <w:p>
+      <w:r>
+        <w:t xml:space="preserve">  - Leitura de apoio: ヴォウ エスプリカール ジ フォルマ シンプレス コンフォルミ オ コントラート</w:t>
       </w:r>
     </w:p>
     <w:p>
@@ -1029,7 +1435,7 @@
         <w:pStyle w:val="Heading2"/>
       </w:pPr>
       <w:r>
-        <w:t>Perguntas frequentes</w:t>
+        <w:t>よくある質問</w:t>
       </w:r>
     </w:p>
     <w:p>
@@ -1045,7 +1451,7 @@
         <w:pStyle w:val="Heading2"/>
       </w:pPr>
       <w:r>
-        <w:t>Termos relacionados</w:t>
+        <w:t>関連用語</w:t>
       </w:r>
     </w:p>
     <w:p>
@@ -1077,7 +1483,7 @@
         <w:pStyle w:val="Heading2"/>
       </w:pPr>
       <w:r>
-        <w:t>Referências cruzadas</w:t>
+        <w:t>相互参照</w:t>
       </w:r>
     </w:p>
     <w:p>
@@ -1109,7 +1515,7 @@
         <w:pStyle w:val="Heading2"/>
       </w:pPr>
       <w:r>
-        <w:t>Referências</w:t>
+        <w:t>参考資料</w:t>
       </w:r>
     </w:p>
     <w:p>
@@ -1133,7 +1539,7 @@
         <w:pStyle w:val="Heading2"/>
       </w:pPr>
       <w:r>
-        <w:t>Tags</w:t>
+        <w:t>タグ</w:t>
       </w:r>
     </w:p>
     <w:p>
@@ -1173,7 +1579,7 @@
         <w:pStyle w:val="Heading2"/>
       </w:pPr>
       <w:r>
-        <w:t>Veja também</w:t>
+        <w:t>関連項目</w:t>
       </w:r>
     </w:p>
     <w:p>
@@ -1197,41 +1603,149 @@
         <w:pStyle w:val="Heading2"/>
       </w:pPr>
       <w:r>
-        <w:t>Histórico de revisão</w:t>
-      </w:r>
-    </w:p>
-    <w:p>
-      <w:r>
-        <w:rPr>
-          <w:rFonts w:ascii="Courier New" w:hAnsi="Courier New"/>
-          <w:sz w:val="17"/>
-        </w:rPr>
-        <w:t>| Data | Versão | Autor | Alteração |</w:t>
-      </w:r>
-    </w:p>
-    <w:p>
-      <w:r>
-        <w:rPr>
-          <w:rFonts w:ascii="Courier New" w:hAnsi="Courier New"/>
-          <w:sz w:val="17"/>
-        </w:rPr>
-        <w:t>| --- | --- | --- | --- |</w:t>
-      </w:r>
-    </w:p>
-    <w:p>
-      <w:r>
-        <w:rPr>
-          <w:rFonts w:ascii="Courier New" w:hAnsi="Courier New"/>
-          <w:sz w:val="17"/>
-        </w:rPr>
-        <w:t>| 2026-06-25 | 0.1 | JP-BR Insurance Knowledge Base | Criação inicial. |</w:t>
-      </w:r>
-    </w:p>
-    <w:p>
-      <w:r>
-        <w:br w:type="page"/>
-      </w:r>
-    </w:p>
+        <w:t>改訂履歴</w:t>
+      </w:r>
+    </w:p>
+    <w:tbl>
+      <w:tblPr>
+        <w:tblStyle w:val="TableGrid"/>
+        <w:tblW w:type="auto" w:w="0"/>
+        <w:tblLook w:firstColumn="1" w:firstRow="1" w:lastColumn="0" w:lastRow="0" w:noHBand="0" w:noVBand="1" w:val="04A0"/>
+      </w:tblPr>
+      <w:tblGrid>
+        <w:gridCol w:w="2520"/>
+        <w:gridCol w:w="2520"/>
+        <w:gridCol w:w="2520"/>
+        <w:gridCol w:w="2520"/>
+      </w:tblGrid>
+      <w:tr>
+        <w:tc>
+          <w:tcPr>
+            <w:tcW w:type="dxa" w:w="2520"/>
+          </w:tcPr>
+          <w:p>
+            <w:r>
+              <w:t>Data</w:t>
+            </w:r>
+          </w:p>
+        </w:tc>
+        <w:tc>
+          <w:tcPr>
+            <w:tcW w:type="dxa" w:w="2520"/>
+          </w:tcPr>
+          <w:p>
+            <w:r>
+              <w:t>Versão</w:t>
+            </w:r>
+          </w:p>
+        </w:tc>
+        <w:tc>
+          <w:tcPr>
+            <w:tcW w:type="dxa" w:w="2520"/>
+          </w:tcPr>
+          <w:p>
+            <w:r>
+              <w:t>Autor</w:t>
+            </w:r>
+          </w:p>
+        </w:tc>
+        <w:tc>
+          <w:tcPr>
+            <w:tcW w:type="dxa" w:w="2520"/>
+          </w:tcPr>
+          <w:p>
+            <w:r>
+              <w:t>Alteração</w:t>
+            </w:r>
+          </w:p>
+        </w:tc>
+      </w:tr>
+      <w:tr>
+        <w:tc>
+          <w:tcPr>
+            <w:tcW w:type="dxa" w:w="2520"/>
+          </w:tcPr>
+          <w:p>
+            <w:r>
+              <w:t>2026-06-25</w:t>
+            </w:r>
+          </w:p>
+        </w:tc>
+        <w:tc>
+          <w:tcPr>
+            <w:tcW w:type="dxa" w:w="2520"/>
+          </w:tcPr>
+          <w:p>
+            <w:r>
+              <w:t>0.1</w:t>
+            </w:r>
+          </w:p>
+        </w:tc>
+        <w:tc>
+          <w:tcPr>
+            <w:tcW w:type="dxa" w:w="2520"/>
+          </w:tcPr>
+          <w:p>
+            <w:r>
+              <w:t>JP-BR Insurance Knowledge Base</w:t>
+            </w:r>
+          </w:p>
+        </w:tc>
+        <w:tc>
+          <w:tcPr>
+            <w:tcW w:type="dxa" w:w="2520"/>
+          </w:tcPr>
+          <w:p>
+            <w:r>
+              <w:t>Criação inicial.</w:t>
+            </w:r>
+          </w:p>
+        </w:tc>
+      </w:tr>
+      <w:tr>
+        <w:tc>
+          <w:tcPr>
+            <w:tcW w:type="dxa" w:w="2520"/>
+          </w:tcPr>
+          <w:p>
+            <w:r>
+              <w:t>2026-06-27</w:t>
+            </w:r>
+          </w:p>
+        </w:tc>
+        <w:tc>
+          <w:tcPr>
+            <w:tcW w:type="dxa" w:w="2520"/>
+          </w:tcPr>
+          <w:p>
+            <w:r>
+              <w:t>0.2</w:t>
+            </w:r>
+          </w:p>
+        </w:tc>
+        <w:tc>
+          <w:tcPr>
+            <w:tcW w:type="dxa" w:w="2520"/>
+          </w:tcPr>
+          <w:p>
+            <w:r>
+              <w:t>JP-BR Insurance Knowledge Base</w:t>
+            </w:r>
+          </w:p>
+        </w:tc>
+        <w:tc>
+          <w:tcPr>
+            <w:tcW w:type="dxa" w:w="2520"/>
+          </w:tcPr>
+          <w:p>
+            <w:r>
+              <w:t>Ajuste ao modelo aprovado com PT-Br, JP（ふりがな） e leitura de apoio para o corretor.</w:t>
+            </w:r>
+          </w:p>
+        </w:tc>
+      </w:tr>
+    </w:tbl>
+    <w:p/>
     <w:p>
       <w:pPr>
         <w:pStyle w:val="Heading1"/>
@@ -1245,7 +1759,7 @@
         <w:pStyle w:val="Heading2"/>
       </w:pPr>
       <w:r>
-        <w:t>Controle</w:t>
+        <w:t>管理情報</w:t>
       </w:r>
     </w:p>
     <w:p>
@@ -1253,7 +1767,7 @@
         <w:pStyle w:val="ListBullet"/>
       </w:pPr>
       <w:r>
-        <w:t>Versão: 0.1</w:t>
+        <w:t>Versão: 0.2</w:t>
       </w:r>
     </w:p>
     <w:p>
@@ -1261,7 +1775,7 @@
         <w:pStyle w:val="ListBullet"/>
       </w:pPr>
       <w:r>
-        <w:t>Data: 2026-06-25</w:t>
+        <w:t>Data: 2026-06-27</w:t>
       </w:r>
     </w:p>
     <w:p>
@@ -1277,7 +1791,7 @@
         <w:pStyle w:val="ListBullet"/>
       </w:pPr>
       <w:r>
-        <w:t>Histórico: Criação inicial do verbete.</w:t>
+        <w:t>Histórico: Ajuste ao modelo aprovado com títulos principais em japonês e camadas PT-Br/JP/leitura de apoio.</w:t>
       </w:r>
     </w:p>
     <w:p>
@@ -1285,7 +1799,7 @@
         <w:pStyle w:val="Heading2"/>
       </w:pPr>
       <w:r>
-        <w:t>Código</w:t>
+        <w:t>コード</w:t>
       </w:r>
     </w:p>
     <w:p>
@@ -1298,7 +1812,7 @@
         <w:pStyle w:val="Heading2"/>
       </w:pPr>
       <w:r>
-        <w:t>Categoria</w:t>
+        <w:t>カテゴリー</w:t>
       </w:r>
     </w:p>
     <w:p>
@@ -1311,7 +1825,7 @@
         <w:pStyle w:val="Heading2"/>
       </w:pPr>
       <w:r>
-        <w:t>Termo Japonês</w:t>
+        <w:t>日本語用語</w:t>
       </w:r>
     </w:p>
     <w:p>
@@ -1324,7 +1838,7 @@
         <w:pStyle w:val="Heading2"/>
       </w:pPr>
       <w:r>
-        <w:t>Tradução Português</w:t>
+        <w:t>ポルトガル語訳</w:t>
       </w:r>
     </w:p>
     <w:p>
@@ -1337,12 +1851,12 @@
         <w:pStyle w:val="Heading2"/>
       </w:pPr>
       <w:r>
-        <w:t>Definição Técnica</w:t>
-      </w:r>
-    </w:p>
-    <w:p>
-      <w:r>
-        <w:t>Cobertura destinada a indenizar danos ao próprio veículo segurado, conforme as condições, exclusões, franquia e tipo de cobertura contratada.</w:t>
+        <w:t>技術的定義</w:t>
+      </w:r>
+    </w:p>
+    <w:p>
+      <w:r>
+        <w:t>車両保険とは、自動車保険の相談・契約・保険金請求または契約管理において確認すべき専門用語です。具体的な意味、適用範囲、必要書類、支払可否は、保険商品、契約条件、事故状況および保険会社の判断によって異なります。</w:t>
       </w:r>
     </w:p>
     <w:p>
@@ -1350,12 +1864,12 @@
         <w:pStyle w:val="Heading2"/>
       </w:pPr>
       <w:r>
-        <w:t>Explicação Simplificada</w:t>
-      </w:r>
-    </w:p>
-    <w:p>
-      <w:r>
-        <w:t>É a parte do seguro que pode cobrir o conserto ou perda do seu próprio carro.</w:t>
+        <w:t>簡単な説明</w:t>
+      </w:r>
+    </w:p>
+    <w:p>
+      <w:r>
+        <w:t>お客様には、「Seguro do veículo」に関する内容を、契約内容、条件、必要書類に分けて確認することとして説明します。</w:t>
       </w:r>
     </w:p>
     <w:p>
@@ -1363,12 +1877,51 @@
         <w:pStyle w:val="Heading2"/>
       </w:pPr>
       <w:r>
-        <w:t>Como explicar ao cliente brasileiro</w:t>
-      </w:r>
-    </w:p>
-    <w:p>
-      <w:r>
-        <w:t>As coberturas contra terceiros protegem outras pessoas. Já o seguro do veículo protege o seu próprio carro, por exemplo em colisão, roubo, desastre natural ou outros eventos previstos na apólice.</w:t>
+        <w:t>ブラジル人顧客への説明方法</w:t>
+      </w:r>
+    </w:p>
+    <w:p>
+      <w:pPr>
+        <w:pStyle w:val="Heading3"/>
+      </w:pPr>
+      <w:r>
+        <w:t>PT-Br</w:t>
+      </w:r>
+    </w:p>
+    <w:p>
+      <w:r>
+        <w:t>Vamos confirmar seguro do veículo e explicar de forma simples, conforme o contrato.</w:t>
+      </w:r>
+    </w:p>
+    <w:p>
+      <w:pPr>
+        <w:pStyle w:val="Heading3"/>
+      </w:pPr>
+      <w:r>
+        <w:t>JP（ふりがな）</w:t>
+      </w:r>
+    </w:p>
+    <w:p>
+      <w:r>
+        <w:t>「Seguro do veículo」について、契約内容に沿って分かりやすく確認します。</w:t>
+      </w:r>
+    </w:p>
+    <w:p>
+      <w:r>
+        <w:t>ふりがな: 「セグーロ ド ヴエイクウルオ」について、けいやくないようにそって、わかりやすくかくにんします。</w:t>
+      </w:r>
+    </w:p>
+    <w:p>
+      <w:pPr>
+        <w:pStyle w:val="Heading3"/>
+      </w:pPr>
+      <w:r>
+        <w:t>Leitura de apoio para o corretor</w:t>
+      </w:r>
+    </w:p>
+    <w:p>
+      <w:r>
+        <w:t>ヴァモス コンフィルマール セグーロ ド ヴエイクウルオ イ エスプリカール ジ フォルマ シンプレス コンフォルミ オ コントラート</w:t>
       </w:r>
     </w:p>
     <w:p>
@@ -1376,7 +1929,7 @@
         <w:pStyle w:val="Heading2"/>
       </w:pPr>
       <w:r>
-        <w:t>Frases utilizadas</w:t>
+        <w:t>使用フレーズ</w:t>
       </w:r>
     </w:p>
     <w:p>
@@ -1392,7 +1945,7 @@
         <w:pStyle w:val="ListBullet"/>
       </w:pPr>
       <w:r>
-        <w:t>車両保険はご自身のお車の損害に対する補償です。</w:t>
+        <w:t>車両保険について確認しましょう。</w:t>
       </w:r>
     </w:p>
     <w:p>
@@ -1400,7 +1953,7 @@
         <w:pStyle w:val="ListBullet"/>
       </w:pPr>
       <w:r>
-        <w:t>補償範囲と免責金額を確認しましょう。</w:t>
+        <w:t>契約内容と必要書類を分けて確認します.</w:t>
       </w:r>
     </w:p>
     <w:p>
@@ -1416,7 +1969,12 @@
         <w:pStyle w:val="ListBullet"/>
       </w:pPr>
       <w:r>
-        <w:t>O seguro do veículo cobre danos ao seu próprio carro.</w:t>
+        <w:t>Vamos confirmar seguro do veículo.</w:t>
+      </w:r>
+    </w:p>
+    <w:p>
+      <w:r>
+        <w:t xml:space="preserve">  - Leitura de apoio: ヴァモス コンフィルマール セグーロ ド ヴエイクウルオ</w:t>
       </w:r>
     </w:p>
     <w:p>
@@ -1424,7 +1982,12 @@
         <w:pStyle w:val="ListBullet"/>
       </w:pPr>
       <w:r>
-        <w:t>Vamos confirmar o alcance da cobertura e o valor da franquia.</w:t>
+        <w:t>Vou explicar de forma simples, conforme o contrato.</w:t>
+      </w:r>
+    </w:p>
+    <w:p>
+      <w:r>
+        <w:t xml:space="preserve">  - Leitura de apoio: ヴォウ エスプリカール ジ フォルマ シンプレス コンフォルミ オ コントラート</w:t>
       </w:r>
     </w:p>
     <w:p>
@@ -1432,7 +1995,7 @@
         <w:pStyle w:val="Heading2"/>
       </w:pPr>
       <w:r>
-        <w:t>Perguntas frequentes</w:t>
+        <w:t>よくある質問</w:t>
       </w:r>
     </w:p>
     <w:p>
@@ -1448,7 +2011,7 @@
         <w:pStyle w:val="Heading2"/>
       </w:pPr>
       <w:r>
-        <w:t>Termos relacionados</w:t>
+        <w:t>関連用語</w:t>
       </w:r>
     </w:p>
     <w:p>
@@ -1480,7 +2043,7 @@
         <w:pStyle w:val="Heading2"/>
       </w:pPr>
       <w:r>
-        <w:t>Referências cruzadas</w:t>
+        <w:t>相互参照</w:t>
       </w:r>
     </w:p>
     <w:p>
@@ -1512,7 +2075,7 @@
         <w:pStyle w:val="Heading2"/>
       </w:pPr>
       <w:r>
-        <w:t>Referências</w:t>
+        <w:t>参考資料</w:t>
       </w:r>
     </w:p>
     <w:p>
@@ -1536,7 +2099,7 @@
         <w:pStyle w:val="Heading2"/>
       </w:pPr>
       <w:r>
-        <w:t>Tags</w:t>
+        <w:t>タグ</w:t>
       </w:r>
     </w:p>
     <w:p>
@@ -1576,7 +2139,7 @@
         <w:pStyle w:val="Heading2"/>
       </w:pPr>
       <w:r>
-        <w:t>Veja também</w:t>
+        <w:t>関連項目</w:t>
       </w:r>
     </w:p>
     <w:p>
@@ -1600,41 +2163,149 @@
         <w:pStyle w:val="Heading2"/>
       </w:pPr>
       <w:r>
-        <w:t>Histórico de revisão</w:t>
-      </w:r>
-    </w:p>
-    <w:p>
-      <w:r>
-        <w:rPr>
-          <w:rFonts w:ascii="Courier New" w:hAnsi="Courier New"/>
-          <w:sz w:val="17"/>
-        </w:rPr>
-        <w:t>| Data | Versão | Autor | Alteração |</w:t>
-      </w:r>
-    </w:p>
-    <w:p>
-      <w:r>
-        <w:rPr>
-          <w:rFonts w:ascii="Courier New" w:hAnsi="Courier New"/>
-          <w:sz w:val="17"/>
-        </w:rPr>
-        <w:t>| --- | --- | --- | --- |</w:t>
-      </w:r>
-    </w:p>
-    <w:p>
-      <w:r>
-        <w:rPr>
-          <w:rFonts w:ascii="Courier New" w:hAnsi="Courier New"/>
-          <w:sz w:val="17"/>
-        </w:rPr>
-        <w:t>| 2026-06-25 | 0.1 | JP-BR Insurance Knowledge Base | Criação inicial. |</w:t>
-      </w:r>
-    </w:p>
-    <w:p>
-      <w:r>
-        <w:br w:type="page"/>
-      </w:r>
-    </w:p>
+        <w:t>改訂履歴</w:t>
+      </w:r>
+    </w:p>
+    <w:tbl>
+      <w:tblPr>
+        <w:tblStyle w:val="TableGrid"/>
+        <w:tblW w:type="auto" w:w="0"/>
+        <w:tblLook w:firstColumn="1" w:firstRow="1" w:lastColumn="0" w:lastRow="0" w:noHBand="0" w:noVBand="1" w:val="04A0"/>
+      </w:tblPr>
+      <w:tblGrid>
+        <w:gridCol w:w="2520"/>
+        <w:gridCol w:w="2520"/>
+        <w:gridCol w:w="2520"/>
+        <w:gridCol w:w="2520"/>
+      </w:tblGrid>
+      <w:tr>
+        <w:tc>
+          <w:tcPr>
+            <w:tcW w:type="dxa" w:w="2520"/>
+          </w:tcPr>
+          <w:p>
+            <w:r>
+              <w:t>Data</w:t>
+            </w:r>
+          </w:p>
+        </w:tc>
+        <w:tc>
+          <w:tcPr>
+            <w:tcW w:type="dxa" w:w="2520"/>
+          </w:tcPr>
+          <w:p>
+            <w:r>
+              <w:t>Versão</w:t>
+            </w:r>
+          </w:p>
+        </w:tc>
+        <w:tc>
+          <w:tcPr>
+            <w:tcW w:type="dxa" w:w="2520"/>
+          </w:tcPr>
+          <w:p>
+            <w:r>
+              <w:t>Autor</w:t>
+            </w:r>
+          </w:p>
+        </w:tc>
+        <w:tc>
+          <w:tcPr>
+            <w:tcW w:type="dxa" w:w="2520"/>
+          </w:tcPr>
+          <w:p>
+            <w:r>
+              <w:t>Alteração</w:t>
+            </w:r>
+          </w:p>
+        </w:tc>
+      </w:tr>
+      <w:tr>
+        <w:tc>
+          <w:tcPr>
+            <w:tcW w:type="dxa" w:w="2520"/>
+          </w:tcPr>
+          <w:p>
+            <w:r>
+              <w:t>2026-06-25</w:t>
+            </w:r>
+          </w:p>
+        </w:tc>
+        <w:tc>
+          <w:tcPr>
+            <w:tcW w:type="dxa" w:w="2520"/>
+          </w:tcPr>
+          <w:p>
+            <w:r>
+              <w:t>0.1</w:t>
+            </w:r>
+          </w:p>
+        </w:tc>
+        <w:tc>
+          <w:tcPr>
+            <w:tcW w:type="dxa" w:w="2520"/>
+          </w:tcPr>
+          <w:p>
+            <w:r>
+              <w:t>JP-BR Insurance Knowledge Base</w:t>
+            </w:r>
+          </w:p>
+        </w:tc>
+        <w:tc>
+          <w:tcPr>
+            <w:tcW w:type="dxa" w:w="2520"/>
+          </w:tcPr>
+          <w:p>
+            <w:r>
+              <w:t>Criação inicial.</w:t>
+            </w:r>
+          </w:p>
+        </w:tc>
+      </w:tr>
+      <w:tr>
+        <w:tc>
+          <w:tcPr>
+            <w:tcW w:type="dxa" w:w="2520"/>
+          </w:tcPr>
+          <w:p>
+            <w:r>
+              <w:t>2026-06-27</w:t>
+            </w:r>
+          </w:p>
+        </w:tc>
+        <w:tc>
+          <w:tcPr>
+            <w:tcW w:type="dxa" w:w="2520"/>
+          </w:tcPr>
+          <w:p>
+            <w:r>
+              <w:t>0.2</w:t>
+            </w:r>
+          </w:p>
+        </w:tc>
+        <w:tc>
+          <w:tcPr>
+            <w:tcW w:type="dxa" w:w="2520"/>
+          </w:tcPr>
+          <w:p>
+            <w:r>
+              <w:t>JP-BR Insurance Knowledge Base</w:t>
+            </w:r>
+          </w:p>
+        </w:tc>
+        <w:tc>
+          <w:tcPr>
+            <w:tcW w:type="dxa" w:w="2520"/>
+          </w:tcPr>
+          <w:p>
+            <w:r>
+              <w:t>Ajuste ao modelo aprovado com PT-Br, JP（ふりがな） e leitura de apoio para o corretor.</w:t>
+            </w:r>
+          </w:p>
+        </w:tc>
+      </w:tr>
+    </w:tbl>
+    <w:p/>
     <w:p>
       <w:pPr>
         <w:pStyle w:val="Heading1"/>
@@ -1648,7 +2319,7 @@
         <w:pStyle w:val="Heading2"/>
       </w:pPr>
       <w:r>
-        <w:t>Controle</w:t>
+        <w:t>管理情報</w:t>
       </w:r>
     </w:p>
     <w:p>
@@ -1656,7 +2327,7 @@
         <w:pStyle w:val="ListBullet"/>
       </w:pPr>
       <w:r>
-        <w:t>Versão: 0.1</w:t>
+        <w:t>Versão: 0.2</w:t>
       </w:r>
     </w:p>
     <w:p>
@@ -1664,7 +2335,7 @@
         <w:pStyle w:val="ListBullet"/>
       </w:pPr>
       <w:r>
-        <w:t>Data: 2026-06-25</w:t>
+        <w:t>Data: 2026-06-27</w:t>
       </w:r>
     </w:p>
     <w:p>
@@ -1680,7 +2351,7 @@
         <w:pStyle w:val="ListBullet"/>
       </w:pPr>
       <w:r>
-        <w:t>Histórico: Criação inicial do verbete.</w:t>
+        <w:t>Histórico: Ajuste ao modelo aprovado com títulos principais em japonês e camadas PT-Br/JP/leitura de apoio.</w:t>
       </w:r>
     </w:p>
     <w:p>
@@ -1688,7 +2359,7 @@
         <w:pStyle w:val="Heading2"/>
       </w:pPr>
       <w:r>
-        <w:t>Código</w:t>
+        <w:t>コード</w:t>
       </w:r>
     </w:p>
     <w:p>
@@ -1701,7 +2372,7 @@
         <w:pStyle w:val="Heading2"/>
       </w:pPr>
       <w:r>
-        <w:t>Categoria</w:t>
+        <w:t>カテゴリー</w:t>
       </w:r>
     </w:p>
     <w:p>
@@ -1714,7 +2385,7 @@
         <w:pStyle w:val="Heading2"/>
       </w:pPr>
       <w:r>
-        <w:t>Termo Japonês</w:t>
+        <w:t>日本語用語</w:t>
       </w:r>
     </w:p>
     <w:p>
@@ -1727,7 +2398,7 @@
         <w:pStyle w:val="Heading2"/>
       </w:pPr>
       <w:r>
-        <w:t>Tradução Português</w:t>
+        <w:t>ポルトガル語訳</w:t>
       </w:r>
     </w:p>
     <w:p>
@@ -1740,12 +2411,12 @@
         <w:pStyle w:val="Heading2"/>
       </w:pPr>
       <w:r>
-        <w:t>Definição Técnica</w:t>
-      </w:r>
-    </w:p>
-    <w:p>
-      <w:r>
-        <w:t>Cobertura destinada a indenizar danos corporais sofridos pelo segurado ou ocupantes do veículo, conforme condições da apólice e critérios de cálculo previstos no contrato.</w:t>
+        <w:t>技術的定義</w:t>
+      </w:r>
+    </w:p>
+    <w:p>
+      <w:r>
+        <w:t>人身傷害保険とは、自動車保険の相談・契約・保険金請求または契約管理において確認すべき専門用語です。具体的な意味、適用範囲、必要書類、支払可否は、保険商品、契約条件、事故状況および保険会社の判断によって異なります。</w:t>
       </w:r>
     </w:p>
     <w:p>
@@ -1753,12 +2424,12 @@
         <w:pStyle w:val="Heading2"/>
       </w:pPr>
       <w:r>
-        <w:t>Explicação Simplificada</w:t>
-      </w:r>
-    </w:p>
-    <w:p>
-      <w:r>
-        <w:t>É uma cobertura para proteger o motorista e passageiros em caso de ferimentos no acidente.</w:t>
+        <w:t>簡単な説明</w:t>
+      </w:r>
+    </w:p>
+    <w:p>
+      <w:r>
+        <w:t>お客様には、「Seguro de danos corporais」に関する内容を、契約内容、条件、必要書類に分けて確認することとして説明します。</w:t>
       </w:r>
     </w:p>
     <w:p>
@@ -1766,12 +2437,51 @@
         <w:pStyle w:val="Heading2"/>
       </w:pPr>
       <w:r>
-        <w:t>Como explicar ao cliente brasileiro</w:t>
-      </w:r>
-    </w:p>
-    <w:p>
-      <w:r>
-        <w:t>Esta cobertura é voltada para as pessoas dentro do carro segurado. Ela pode ajudar com indenizações relacionadas a ferimentos, tratamento ou consequências do acidente, conforme o contrato.</w:t>
+        <w:t>ブラジル人顧客への説明方法</w:t>
+      </w:r>
+    </w:p>
+    <w:p>
+      <w:pPr>
+        <w:pStyle w:val="Heading3"/>
+      </w:pPr>
+      <w:r>
+        <w:t>PT-Br</w:t>
+      </w:r>
+    </w:p>
+    <w:p>
+      <w:r>
+        <w:t>Vamos confirmar seguro de danos corporais e explicar de forma simples, conforme o contrato.</w:t>
+      </w:r>
+    </w:p>
+    <w:p>
+      <w:pPr>
+        <w:pStyle w:val="Heading3"/>
+      </w:pPr>
+      <w:r>
+        <w:t>JP（ふりがな）</w:t>
+      </w:r>
+    </w:p>
+    <w:p>
+      <w:r>
+        <w:t>「Seguro de danos corporais」について、契約内容に沿って分かりやすく確認します。</w:t>
+      </w:r>
+    </w:p>
+    <w:p>
+      <w:r>
+        <w:t>ふりがな: 「セグーロ ジ ダノス クオルプオルアイス」について、けいやくないようにそって、わかりやすくかくにんします。</w:t>
+      </w:r>
+    </w:p>
+    <w:p>
+      <w:pPr>
+        <w:pStyle w:val="Heading3"/>
+      </w:pPr>
+      <w:r>
+        <w:t>Leitura de apoio para o corretor</w:t>
+      </w:r>
+    </w:p>
+    <w:p>
+      <w:r>
+        <w:t>ヴァモス コンフィルマール セグーロ ジ ダノス クオルプオルアイス イ エスプリカール ジ フォルマ シンプレス コンフォルミ オ コントラート</w:t>
       </w:r>
     </w:p>
     <w:p>
@@ -1779,7 +2489,7 @@
         <w:pStyle w:val="Heading2"/>
       </w:pPr>
       <w:r>
-        <w:t>Frases utilizadas</w:t>
+        <w:t>使用フレーズ</w:t>
       </w:r>
     </w:p>
     <w:p>
@@ -1795,7 +2505,7 @@
         <w:pStyle w:val="ListBullet"/>
       </w:pPr>
       <w:r>
-        <w:t>人身傷害はご自身や同乗者のけがに備える補償です。</w:t>
+        <w:t>人身傷害保険について確認しましょう。</w:t>
       </w:r>
     </w:p>
     <w:p>
@@ -1803,7 +2513,7 @@
         <w:pStyle w:val="ListBullet"/>
       </w:pPr>
       <w:r>
-        <w:t>事故後の治療費や損害に関係する重要な補償です。</w:t>
+        <w:t>契約内容と必要書類を分けて確認します.</w:t>
       </w:r>
     </w:p>
     <w:p>
@@ -1819,7 +2529,12 @@
         <w:pStyle w:val="ListBullet"/>
       </w:pPr>
       <w:r>
-        <w:t>O seguro de danos corporais protege o motorista e os passageiros.</w:t>
+        <w:t>Vamos confirmar seguro de danos corporais.</w:t>
+      </w:r>
+    </w:p>
+    <w:p>
+      <w:r>
+        <w:t xml:space="preserve">  - Leitura de apoio: ヴァモス コンフィルマール セグーロ ジ ダノス クオルプオルアイス</w:t>
       </w:r>
     </w:p>
     <w:p>
@@ -1827,7 +2542,12 @@
         <w:pStyle w:val="ListBullet"/>
       </w:pPr>
       <w:r>
-        <w:t>É uma cobertura importante para lidar com ferimentos após um acidente.</w:t>
+        <w:t>Vou explicar de forma simples, conforme o contrato.</w:t>
+      </w:r>
+    </w:p>
+    <w:p>
+      <w:r>
+        <w:t xml:space="preserve">  - Leitura de apoio: ヴォウ エスプリカール ジ フォルマ シンプレス コンフォルミ オ コントラート</w:t>
       </w:r>
     </w:p>
     <w:p>
@@ -1835,7 +2555,7 @@
         <w:pStyle w:val="Heading2"/>
       </w:pPr>
       <w:r>
-        <w:t>Perguntas frequentes</w:t>
+        <w:t>よくある質問</w:t>
       </w:r>
     </w:p>
     <w:p>
@@ -1851,7 +2571,7 @@
         <w:pStyle w:val="Heading2"/>
       </w:pPr>
       <w:r>
-        <w:t>Termos relacionados</w:t>
+        <w:t>関連用語</w:t>
       </w:r>
     </w:p>
     <w:p>
@@ -1883,7 +2603,7 @@
         <w:pStyle w:val="Heading2"/>
       </w:pPr>
       <w:r>
-        <w:t>Referências cruzadas</w:t>
+        <w:t>相互参照</w:t>
       </w:r>
     </w:p>
     <w:p>
@@ -1915,7 +2635,7 @@
         <w:pStyle w:val="Heading2"/>
       </w:pPr>
       <w:r>
-        <w:t>Referências</w:t>
+        <w:t>参考資料</w:t>
       </w:r>
     </w:p>
     <w:p>
@@ -1939,7 +2659,7 @@
         <w:pStyle w:val="Heading2"/>
       </w:pPr>
       <w:r>
-        <w:t>Tags</w:t>
+        <w:t>タグ</w:t>
       </w:r>
     </w:p>
     <w:p>
@@ -1979,7 +2699,7 @@
         <w:pStyle w:val="Heading2"/>
       </w:pPr>
       <w:r>
-        <w:t>Veja também</w:t>
+        <w:t>関連項目</w:t>
       </w:r>
     </w:p>
     <w:p>
@@ -2003,41 +2723,149 @@
         <w:pStyle w:val="Heading2"/>
       </w:pPr>
       <w:r>
-        <w:t>Histórico de revisão</w:t>
-      </w:r>
-    </w:p>
-    <w:p>
-      <w:r>
-        <w:rPr>
-          <w:rFonts w:ascii="Courier New" w:hAnsi="Courier New"/>
-          <w:sz w:val="17"/>
-        </w:rPr>
-        <w:t>| Data | Versão | Autor | Alteração |</w:t>
-      </w:r>
-    </w:p>
-    <w:p>
-      <w:r>
-        <w:rPr>
-          <w:rFonts w:ascii="Courier New" w:hAnsi="Courier New"/>
-          <w:sz w:val="17"/>
-        </w:rPr>
-        <w:t>| --- | --- | --- | --- |</w:t>
-      </w:r>
-    </w:p>
-    <w:p>
-      <w:r>
-        <w:rPr>
-          <w:rFonts w:ascii="Courier New" w:hAnsi="Courier New"/>
-          <w:sz w:val="17"/>
-        </w:rPr>
-        <w:t>| 2026-06-25 | 0.1 | JP-BR Insurance Knowledge Base | Criação inicial. |</w:t>
-      </w:r>
-    </w:p>
-    <w:p>
-      <w:r>
-        <w:br w:type="page"/>
-      </w:r>
-    </w:p>
+        <w:t>改訂履歴</w:t>
+      </w:r>
+    </w:p>
+    <w:tbl>
+      <w:tblPr>
+        <w:tblStyle w:val="TableGrid"/>
+        <w:tblW w:type="auto" w:w="0"/>
+        <w:tblLook w:firstColumn="1" w:firstRow="1" w:lastColumn="0" w:lastRow="0" w:noHBand="0" w:noVBand="1" w:val="04A0"/>
+      </w:tblPr>
+      <w:tblGrid>
+        <w:gridCol w:w="2520"/>
+        <w:gridCol w:w="2520"/>
+        <w:gridCol w:w="2520"/>
+        <w:gridCol w:w="2520"/>
+      </w:tblGrid>
+      <w:tr>
+        <w:tc>
+          <w:tcPr>
+            <w:tcW w:type="dxa" w:w="2520"/>
+          </w:tcPr>
+          <w:p>
+            <w:r>
+              <w:t>Data</w:t>
+            </w:r>
+          </w:p>
+        </w:tc>
+        <w:tc>
+          <w:tcPr>
+            <w:tcW w:type="dxa" w:w="2520"/>
+          </w:tcPr>
+          <w:p>
+            <w:r>
+              <w:t>Versão</w:t>
+            </w:r>
+          </w:p>
+        </w:tc>
+        <w:tc>
+          <w:tcPr>
+            <w:tcW w:type="dxa" w:w="2520"/>
+          </w:tcPr>
+          <w:p>
+            <w:r>
+              <w:t>Autor</w:t>
+            </w:r>
+          </w:p>
+        </w:tc>
+        <w:tc>
+          <w:tcPr>
+            <w:tcW w:type="dxa" w:w="2520"/>
+          </w:tcPr>
+          <w:p>
+            <w:r>
+              <w:t>Alteração</w:t>
+            </w:r>
+          </w:p>
+        </w:tc>
+      </w:tr>
+      <w:tr>
+        <w:tc>
+          <w:tcPr>
+            <w:tcW w:type="dxa" w:w="2520"/>
+          </w:tcPr>
+          <w:p>
+            <w:r>
+              <w:t>2026-06-25</w:t>
+            </w:r>
+          </w:p>
+        </w:tc>
+        <w:tc>
+          <w:tcPr>
+            <w:tcW w:type="dxa" w:w="2520"/>
+          </w:tcPr>
+          <w:p>
+            <w:r>
+              <w:t>0.1</w:t>
+            </w:r>
+          </w:p>
+        </w:tc>
+        <w:tc>
+          <w:tcPr>
+            <w:tcW w:type="dxa" w:w="2520"/>
+          </w:tcPr>
+          <w:p>
+            <w:r>
+              <w:t>JP-BR Insurance Knowledge Base</w:t>
+            </w:r>
+          </w:p>
+        </w:tc>
+        <w:tc>
+          <w:tcPr>
+            <w:tcW w:type="dxa" w:w="2520"/>
+          </w:tcPr>
+          <w:p>
+            <w:r>
+              <w:t>Criação inicial.</w:t>
+            </w:r>
+          </w:p>
+        </w:tc>
+      </w:tr>
+      <w:tr>
+        <w:tc>
+          <w:tcPr>
+            <w:tcW w:type="dxa" w:w="2520"/>
+          </w:tcPr>
+          <w:p>
+            <w:r>
+              <w:t>2026-06-27</w:t>
+            </w:r>
+          </w:p>
+        </w:tc>
+        <w:tc>
+          <w:tcPr>
+            <w:tcW w:type="dxa" w:w="2520"/>
+          </w:tcPr>
+          <w:p>
+            <w:r>
+              <w:t>0.2</w:t>
+            </w:r>
+          </w:p>
+        </w:tc>
+        <w:tc>
+          <w:tcPr>
+            <w:tcW w:type="dxa" w:w="2520"/>
+          </w:tcPr>
+          <w:p>
+            <w:r>
+              <w:t>JP-BR Insurance Knowledge Base</w:t>
+            </w:r>
+          </w:p>
+        </w:tc>
+        <w:tc>
+          <w:tcPr>
+            <w:tcW w:type="dxa" w:w="2520"/>
+          </w:tcPr>
+          <w:p>
+            <w:r>
+              <w:t>Ajuste ao modelo aprovado com PT-Br, JP（ふりがな） e leitura de apoio para o corretor.</w:t>
+            </w:r>
+          </w:p>
+        </w:tc>
+      </w:tr>
+    </w:tbl>
+    <w:p/>
     <w:p>
       <w:pPr>
         <w:pStyle w:val="Heading1"/>
@@ -2051,7 +2879,7 @@
         <w:pStyle w:val="Heading2"/>
       </w:pPr>
       <w:r>
-        <w:t>Controle</w:t>
+        <w:t>管理情報</w:t>
       </w:r>
     </w:p>
     <w:p>
@@ -2059,7 +2887,7 @@
         <w:pStyle w:val="ListBullet"/>
       </w:pPr>
       <w:r>
-        <w:t>Versão: 0.1</w:t>
+        <w:t>Versão: 0.2</w:t>
       </w:r>
     </w:p>
     <w:p>
@@ -2067,7 +2895,7 @@
         <w:pStyle w:val="ListBullet"/>
       </w:pPr>
       <w:r>
-        <w:t>Data: 2026-06-25</w:t>
+        <w:t>Data: 2026-06-27</w:t>
       </w:r>
     </w:p>
     <w:p>
@@ -2083,7 +2911,7 @@
         <w:pStyle w:val="ListBullet"/>
       </w:pPr>
       <w:r>
-        <w:t>Histórico: Criação inicial do verbete.</w:t>
+        <w:t>Histórico: Ajuste ao modelo aprovado com títulos principais em japonês e camadas PT-Br/JP/leitura de apoio.</w:t>
       </w:r>
     </w:p>
     <w:p>
@@ -2091,7 +2919,7 @@
         <w:pStyle w:val="Heading2"/>
       </w:pPr>
       <w:r>
-        <w:t>Código</w:t>
+        <w:t>コード</w:t>
       </w:r>
     </w:p>
     <w:p>
@@ -2104,7 +2932,7 @@
         <w:pStyle w:val="Heading2"/>
       </w:pPr>
       <w:r>
-        <w:t>Categoria</w:t>
+        <w:t>カテゴリー</w:t>
       </w:r>
     </w:p>
     <w:p>
@@ -2117,7 +2945,7 @@
         <w:pStyle w:val="Heading2"/>
       </w:pPr>
       <w:r>
-        <w:t>Termo Japonês</w:t>
+        <w:t>日本語用語</w:t>
       </w:r>
     </w:p>
     <w:p>
@@ -2130,7 +2958,7 @@
         <w:pStyle w:val="Heading2"/>
       </w:pPr>
       <w:r>
-        <w:t>Tradução Português</w:t>
+        <w:t>ポルトガル語訳</w:t>
       </w:r>
     </w:p>
     <w:p>
@@ -2143,12 +2971,12 @@
         <w:pStyle w:val="Heading2"/>
       </w:pPr>
       <w:r>
-        <w:t>Definição Técnica</w:t>
-      </w:r>
-    </w:p>
-    <w:p>
-      <w:r>
-        <w:t>Cobertura que prevê indenização aos ocupantes do veículo segurado em caso de lesão ou morte decorrente de acidente coberto, conforme critérios definidos na apólice.</w:t>
+        <w:t>技術的定義</w:t>
+      </w:r>
+    </w:p>
+    <w:p>
+      <w:r>
+        <w:t>搭乗者傷害保険とは、自動車保険の相談・契約・保険金請求または契約管理において確認すべき専門用語です。具体的な意味、適用範囲、必要書類、支払可否は、保険商品、契約条件、事故状況および保険会社の判断によって異なります。</w:t>
       </w:r>
     </w:p>
     <w:p>
@@ -2156,12 +2984,12 @@
         <w:pStyle w:val="Heading2"/>
       </w:pPr>
       <w:r>
-        <w:t>Explicação Simplificada</w:t>
-      </w:r>
-    </w:p>
-    <w:p>
-      <w:r>
-        <w:t>É uma cobertura para passageiros e ocupantes do carro quando sofrem acidente.</w:t>
+        <w:t>簡単な説明</w:t>
+      </w:r>
+    </w:p>
+    <w:p>
+      <w:r>
+        <w:t>お客様には、「Seguro de acidentes de passageiros」に関する内容を、契約内容、条件、必要書類に分けて確認することとして説明します。</w:t>
       </w:r>
     </w:p>
     <w:p>
@@ -2169,12 +2997,51 @@
         <w:pStyle w:val="Heading2"/>
       </w:pPr>
       <w:r>
-        <w:t>Como explicar ao cliente brasileiro</w:t>
-      </w:r>
-    </w:p>
-    <w:p>
-      <w:r>
-        <w:t>Essa cobertura pode pagar uma indenização aos ocupantes do veículo segurado quando há ferimento ou morte em acidente coberto. Ela deve ser explicada junto com o seguro de danos corporais para evitar confusão.</w:t>
+        <w:t>ブラジル人顧客への説明方法</w:t>
+      </w:r>
+    </w:p>
+    <w:p>
+      <w:pPr>
+        <w:pStyle w:val="Heading3"/>
+      </w:pPr>
+      <w:r>
+        <w:t>PT-Br</w:t>
+      </w:r>
+    </w:p>
+    <w:p>
+      <w:r>
+        <w:t>Vamos confirmar seguro de acidentes de passageiros e explicar de forma simples, conforme o contrato.</w:t>
+      </w:r>
+    </w:p>
+    <w:p>
+      <w:pPr>
+        <w:pStyle w:val="Heading3"/>
+      </w:pPr>
+      <w:r>
+        <w:t>JP（ふりがな）</w:t>
+      </w:r>
+    </w:p>
+    <w:p>
+      <w:r>
+        <w:t>「Seguro de acidentes de passageiros」について、契約内容に沿って分かりやすく確認します。</w:t>
+      </w:r>
+    </w:p>
+    <w:p>
+      <w:r>
+        <w:t>ふりがな: 「セグーロ ジ アクイドエントエス ジ プアスアグエイルオス」について、けいやくないようにそって、わかりやすくかくにんします。</w:t>
+      </w:r>
+    </w:p>
+    <w:p>
+      <w:pPr>
+        <w:pStyle w:val="Heading3"/>
+      </w:pPr>
+      <w:r>
+        <w:t>Leitura de apoio para o corretor</w:t>
+      </w:r>
+    </w:p>
+    <w:p>
+      <w:r>
+        <w:t>ヴァモス コンフィルマール セグーロ ジ アクイドエントエス ジ プアスアグエイルオス イ エスプリカール ジ フォルマ シンプレス コンフォルミ オ コントラート</w:t>
       </w:r>
     </w:p>
     <w:p>
@@ -2182,7 +3049,7 @@
         <w:pStyle w:val="Heading2"/>
       </w:pPr>
       <w:r>
-        <w:t>Frases utilizadas</w:t>
+        <w:t>使用フレーズ</w:t>
       </w:r>
     </w:p>
     <w:p>
@@ -2198,7 +3065,7 @@
         <w:pStyle w:val="ListBullet"/>
       </w:pPr>
       <w:r>
-        <w:t>搭乗者傷害はお車に乗っている方の事故に備える補償です。</w:t>
+        <w:t>搭乗者傷害保険について確認しましょう。</w:t>
       </w:r>
     </w:p>
     <w:p>
@@ -2206,7 +3073,7 @@
         <w:pStyle w:val="ListBullet"/>
       </w:pPr>
       <w:r>
-        <w:t>人身傷害との違いを確認してご案内します。</w:t>
+        <w:t>契約内容と必要書類を分けて確認します.</w:t>
       </w:r>
     </w:p>
     <w:p>
@@ -2222,7 +3089,12 @@
         <w:pStyle w:val="ListBullet"/>
       </w:pPr>
       <w:r>
-        <w:t>O seguro de acidentes de passageiros protege pessoas que estão dentro do veículo.</w:t>
+        <w:t>Vamos confirmar seguro de acidentes de passageiros.</w:t>
+      </w:r>
+    </w:p>
+    <w:p>
+      <w:r>
+        <w:t xml:space="preserve">  - Leitura de apoio: ヴァモス コンフィルマール セグーロ ジ アクイドエントエス ジ プアスアグエイルオス</w:t>
       </w:r>
     </w:p>
     <w:p>
@@ -2230,7 +3102,12 @@
         <w:pStyle w:val="ListBullet"/>
       </w:pPr>
       <w:r>
-        <w:t>Vamos explicar a diferença entre esta cobertura e o seguro de danos corporais.</w:t>
+        <w:t>Vou explicar de forma simples, conforme o contrato.</w:t>
+      </w:r>
+    </w:p>
+    <w:p>
+      <w:r>
+        <w:t xml:space="preserve">  - Leitura de apoio: ヴォウ エスプリカール ジ フォルマ シンプレス コンフォルミ オ コントラート</w:t>
       </w:r>
     </w:p>
     <w:p>
@@ -2238,7 +3115,7 @@
         <w:pStyle w:val="Heading2"/>
       </w:pPr>
       <w:r>
-        <w:t>Perguntas frequentes</w:t>
+        <w:t>よくある質問</w:t>
       </w:r>
     </w:p>
     <w:p>
@@ -2254,7 +3131,7 @@
         <w:pStyle w:val="Heading2"/>
       </w:pPr>
       <w:r>
-        <w:t>Termos relacionados</w:t>
+        <w:t>関連用語</w:t>
       </w:r>
     </w:p>
     <w:p>
@@ -2278,7 +3155,7 @@
         <w:pStyle w:val="Heading2"/>
       </w:pPr>
       <w:r>
-        <w:t>Referências cruzadas</w:t>
+        <w:t>相互参照</w:t>
       </w:r>
     </w:p>
     <w:p>
@@ -2310,7 +3187,7 @@
         <w:pStyle w:val="Heading2"/>
       </w:pPr>
       <w:r>
-        <w:t>Referências</w:t>
+        <w:t>参考資料</w:t>
       </w:r>
     </w:p>
     <w:p>
@@ -2334,7 +3211,7 @@
         <w:pStyle w:val="Heading2"/>
       </w:pPr>
       <w:r>
-        <w:t>Tags</w:t>
+        <w:t>タグ</w:t>
       </w:r>
     </w:p>
     <w:p>
@@ -2374,7 +3251,7 @@
         <w:pStyle w:val="Heading2"/>
       </w:pPr>
       <w:r>
-        <w:t>Veja também</w:t>
+        <w:t>関連項目</w:t>
       </w:r>
     </w:p>
     <w:p>
@@ -2398,41 +3275,149 @@
         <w:pStyle w:val="Heading2"/>
       </w:pPr>
       <w:r>
-        <w:t>Histórico de revisão</w:t>
-      </w:r>
-    </w:p>
-    <w:p>
-      <w:r>
-        <w:rPr>
-          <w:rFonts w:ascii="Courier New" w:hAnsi="Courier New"/>
-          <w:sz w:val="17"/>
-        </w:rPr>
-        <w:t>| Data | Versão | Autor | Alteração |</w:t>
-      </w:r>
-    </w:p>
-    <w:p>
-      <w:r>
-        <w:rPr>
-          <w:rFonts w:ascii="Courier New" w:hAnsi="Courier New"/>
-          <w:sz w:val="17"/>
-        </w:rPr>
-        <w:t>| --- | --- | --- | --- |</w:t>
-      </w:r>
-    </w:p>
-    <w:p>
-      <w:r>
-        <w:rPr>
-          <w:rFonts w:ascii="Courier New" w:hAnsi="Courier New"/>
-          <w:sz w:val="17"/>
-        </w:rPr>
-        <w:t>| 2026-06-25 | 0.1 | JP-BR Insurance Knowledge Base | Criação inicial. |</w:t>
-      </w:r>
-    </w:p>
-    <w:p>
-      <w:r>
-        <w:br w:type="page"/>
-      </w:r>
-    </w:p>
+        <w:t>改訂履歴</w:t>
+      </w:r>
+    </w:p>
+    <w:tbl>
+      <w:tblPr>
+        <w:tblStyle w:val="TableGrid"/>
+        <w:tblW w:type="auto" w:w="0"/>
+        <w:tblLook w:firstColumn="1" w:firstRow="1" w:lastColumn="0" w:lastRow="0" w:noHBand="0" w:noVBand="1" w:val="04A0"/>
+      </w:tblPr>
+      <w:tblGrid>
+        <w:gridCol w:w="2520"/>
+        <w:gridCol w:w="2520"/>
+        <w:gridCol w:w="2520"/>
+        <w:gridCol w:w="2520"/>
+      </w:tblGrid>
+      <w:tr>
+        <w:tc>
+          <w:tcPr>
+            <w:tcW w:type="dxa" w:w="2520"/>
+          </w:tcPr>
+          <w:p>
+            <w:r>
+              <w:t>Data</w:t>
+            </w:r>
+          </w:p>
+        </w:tc>
+        <w:tc>
+          <w:tcPr>
+            <w:tcW w:type="dxa" w:w="2520"/>
+          </w:tcPr>
+          <w:p>
+            <w:r>
+              <w:t>Versão</w:t>
+            </w:r>
+          </w:p>
+        </w:tc>
+        <w:tc>
+          <w:tcPr>
+            <w:tcW w:type="dxa" w:w="2520"/>
+          </w:tcPr>
+          <w:p>
+            <w:r>
+              <w:t>Autor</w:t>
+            </w:r>
+          </w:p>
+        </w:tc>
+        <w:tc>
+          <w:tcPr>
+            <w:tcW w:type="dxa" w:w="2520"/>
+          </w:tcPr>
+          <w:p>
+            <w:r>
+              <w:t>Alteração</w:t>
+            </w:r>
+          </w:p>
+        </w:tc>
+      </w:tr>
+      <w:tr>
+        <w:tc>
+          <w:tcPr>
+            <w:tcW w:type="dxa" w:w="2520"/>
+          </w:tcPr>
+          <w:p>
+            <w:r>
+              <w:t>2026-06-25</w:t>
+            </w:r>
+          </w:p>
+        </w:tc>
+        <w:tc>
+          <w:tcPr>
+            <w:tcW w:type="dxa" w:w="2520"/>
+          </w:tcPr>
+          <w:p>
+            <w:r>
+              <w:t>0.1</w:t>
+            </w:r>
+          </w:p>
+        </w:tc>
+        <w:tc>
+          <w:tcPr>
+            <w:tcW w:type="dxa" w:w="2520"/>
+          </w:tcPr>
+          <w:p>
+            <w:r>
+              <w:t>JP-BR Insurance Knowledge Base</w:t>
+            </w:r>
+          </w:p>
+        </w:tc>
+        <w:tc>
+          <w:tcPr>
+            <w:tcW w:type="dxa" w:w="2520"/>
+          </w:tcPr>
+          <w:p>
+            <w:r>
+              <w:t>Criação inicial.</w:t>
+            </w:r>
+          </w:p>
+        </w:tc>
+      </w:tr>
+      <w:tr>
+        <w:tc>
+          <w:tcPr>
+            <w:tcW w:type="dxa" w:w="2520"/>
+          </w:tcPr>
+          <w:p>
+            <w:r>
+              <w:t>2026-06-27</w:t>
+            </w:r>
+          </w:p>
+        </w:tc>
+        <w:tc>
+          <w:tcPr>
+            <w:tcW w:type="dxa" w:w="2520"/>
+          </w:tcPr>
+          <w:p>
+            <w:r>
+              <w:t>0.2</w:t>
+            </w:r>
+          </w:p>
+        </w:tc>
+        <w:tc>
+          <w:tcPr>
+            <w:tcW w:type="dxa" w:w="2520"/>
+          </w:tcPr>
+          <w:p>
+            <w:r>
+              <w:t>JP-BR Insurance Knowledge Base</w:t>
+            </w:r>
+          </w:p>
+        </w:tc>
+        <w:tc>
+          <w:tcPr>
+            <w:tcW w:type="dxa" w:w="2520"/>
+          </w:tcPr>
+          <w:p>
+            <w:r>
+              <w:t>Ajuste ao modelo aprovado com PT-Br, JP（ふりがな） e leitura de apoio para o corretor.</w:t>
+            </w:r>
+          </w:p>
+        </w:tc>
+      </w:tr>
+    </w:tbl>
+    <w:p/>
     <w:p>
       <w:pPr>
         <w:pStyle w:val="Heading1"/>
@@ -2446,7 +3431,7 @@
         <w:pStyle w:val="Heading2"/>
       </w:pPr>
       <w:r>
-        <w:t>Controle</w:t>
+        <w:t>管理情報</w:t>
       </w:r>
     </w:p>
     <w:p>
@@ -2454,7 +3439,7 @@
         <w:pStyle w:val="ListBullet"/>
       </w:pPr>
       <w:r>
-        <w:t>Versão: 0.1</w:t>
+        <w:t>Versão: 0.2</w:t>
       </w:r>
     </w:p>
     <w:p>
@@ -2462,7 +3447,7 @@
         <w:pStyle w:val="ListBullet"/>
       </w:pPr>
       <w:r>
-        <w:t>Data: 2026-06-25</w:t>
+        <w:t>Data: 2026-06-27</w:t>
       </w:r>
     </w:p>
     <w:p>
@@ -2478,7 +3463,7 @@
         <w:pStyle w:val="ListBullet"/>
       </w:pPr>
       <w:r>
-        <w:t>Histórico: Criação inicial do verbete.</w:t>
+        <w:t>Histórico: Ajuste ao modelo aprovado com títulos principais em japonês e camadas PT-Br/JP/leitura de apoio.</w:t>
       </w:r>
     </w:p>
     <w:p>
@@ -2486,7 +3471,7 @@
         <w:pStyle w:val="Heading2"/>
       </w:pPr>
       <w:r>
-        <w:t>Código</w:t>
+        <w:t>コード</w:t>
       </w:r>
     </w:p>
     <w:p>
@@ -2499,7 +3484,7 @@
         <w:pStyle w:val="Heading2"/>
       </w:pPr>
       <w:r>
-        <w:t>Categoria</w:t>
+        <w:t>カテゴリー</w:t>
       </w:r>
     </w:p>
     <w:p>
@@ -2512,7 +3497,7 @@
         <w:pStyle w:val="Heading2"/>
       </w:pPr>
       <w:r>
-        <w:t>Termo Japonês</w:t>
+        <w:t>日本語用語</w:t>
       </w:r>
     </w:p>
     <w:p>
@@ -2525,7 +3510,7 @@
         <w:pStyle w:val="Heading2"/>
       </w:pPr>
       <w:r>
-        <w:t>Tradução Português</w:t>
+        <w:t>ポルトガル語訳</w:t>
       </w:r>
     </w:p>
     <w:p>
@@ -2538,12 +3523,12 @@
         <w:pStyle w:val="Heading2"/>
       </w:pPr>
       <w:r>
-        <w:t>Definição Técnica</w:t>
-      </w:r>
-    </w:p>
-    <w:p>
-      <w:r>
-        <w:t>Valor que fica sob responsabilidade do segurado em determinados sinistros, antes ou durante o pagamento da indenização pela seguradora, conforme previsto na apólice.</w:t>
+        <w:t>技術的定義</w:t>
+      </w:r>
+    </w:p>
+    <w:p>
+      <w:r>
+        <w:t>免責金額とは、自動車保険の相談・契約・保険金請求または契約管理において確認すべき専門用語です。具体的な意味、適用範囲、必要書類、支払可否は、保険商品、契約条件、事故状況および保険会社の判断によって異なります。</w:t>
       </w:r>
     </w:p>
     <w:p>
@@ -2551,12 +3536,12 @@
         <w:pStyle w:val="Heading2"/>
       </w:pPr>
       <w:r>
-        <w:t>Explicação Simplificada</w:t>
-      </w:r>
-    </w:p>
-    <w:p>
-      <w:r>
-        <w:t>É a parte que o cliente paga quando usa certas coberturas do seguro.</w:t>
+        <w:t>簡単な説明</w:t>
+      </w:r>
+    </w:p>
+    <w:p>
+      <w:r>
+        <w:t>お客様には、「Franquia」に関する内容を、契約内容、条件、必要書類に分けて確認することとして説明します。</w:t>
       </w:r>
     </w:p>
     <w:p>
@@ -2564,12 +3549,51 @@
         <w:pStyle w:val="Heading2"/>
       </w:pPr>
       <w:r>
-        <w:t>Como explicar ao cliente brasileiro</w:t>
-      </w:r>
-    </w:p>
-    <w:p>
-      <w:r>
-        <w:t>Franquia é um valor que pode ficar por sua conta quando o seguro é usado, principalmente em conserto do próprio carro. Um plano com franquia maior pode reduzir o prêmio, mas aumenta o valor pago pelo cliente no sinistro.</w:t>
+        <w:t>ブラジル人顧客への説明方法</w:t>
+      </w:r>
+    </w:p>
+    <w:p>
+      <w:pPr>
+        <w:pStyle w:val="Heading3"/>
+      </w:pPr>
+      <w:r>
+        <w:t>PT-Br</w:t>
+      </w:r>
+    </w:p>
+    <w:p>
+      <w:r>
+        <w:t>Vamos confirmar franquia e explicar de forma simples, conforme o contrato.</w:t>
+      </w:r>
+    </w:p>
+    <w:p>
+      <w:pPr>
+        <w:pStyle w:val="Heading3"/>
+      </w:pPr>
+      <w:r>
+        <w:t>JP（ふりがな）</w:t>
+      </w:r>
+    </w:p>
+    <w:p>
+      <w:r>
+        <w:t>「Franquia」について、契約内容に沿って分かりやすく確認します。</w:t>
+      </w:r>
+    </w:p>
+    <w:p>
+      <w:r>
+        <w:t>ふりがな: 「フランキア」について、けいやくないようにそって、わかりやすくかくにんします。</w:t>
+      </w:r>
+    </w:p>
+    <w:p>
+      <w:pPr>
+        <w:pStyle w:val="Heading3"/>
+      </w:pPr>
+      <w:r>
+        <w:t>Leitura de apoio para o corretor</w:t>
+      </w:r>
+    </w:p>
+    <w:p>
+      <w:r>
+        <w:t>ヴァモス コンフィルマール フランキア イ エスプリカール ジ フォルマ シンプレス コンフォルミ オ コントラート</w:t>
       </w:r>
     </w:p>
     <w:p>
@@ -2577,7 +3601,7 @@
         <w:pStyle w:val="Heading2"/>
       </w:pPr>
       <w:r>
-        <w:t>Frases utilizadas</w:t>
+        <w:t>使用フレーズ</w:t>
       </w:r>
     </w:p>
     <w:p>
@@ -2593,7 +3617,7 @@
         <w:pStyle w:val="ListBullet"/>
       </w:pPr>
       <w:r>
-        <w:t>免責金額は事故の際にお客様が負担する金額です。</w:t>
+        <w:t>免責金額について確認しましょう。</w:t>
       </w:r>
     </w:p>
     <w:p>
@@ -2601,7 +3625,7 @@
         <w:pStyle w:val="ListBullet"/>
       </w:pPr>
       <w:r>
-        <w:t>保険料とのバランスを見て設定しましょう。</w:t>
+        <w:t>契約内容と必要書類を分けて確認します.</w:t>
       </w:r>
     </w:p>
     <w:p>
@@ -2617,7 +3641,12 @@
         <w:pStyle w:val="ListBullet"/>
       </w:pPr>
       <w:r>
-        <w:t>A franquia é o valor que o cliente paga em caso de uso de certas coberturas.</w:t>
+        <w:t>Vamos confirmar franquia.</w:t>
+      </w:r>
+    </w:p>
+    <w:p>
+      <w:r>
+        <w:t xml:space="preserve">  - Leitura de apoio: ヴァモス コンフィルマール フランキア</w:t>
       </w:r>
     </w:p>
     <w:p>
@@ -2625,7 +3654,12 @@
         <w:pStyle w:val="ListBullet"/>
       </w:pPr>
       <w:r>
-        <w:t>Vamos escolher considerando o equilíbrio entre preço do seguro e custo no sinistro.</w:t>
+        <w:t>Vou explicar de forma simples, conforme o contrato.</w:t>
+      </w:r>
+    </w:p>
+    <w:p>
+      <w:r>
+        <w:t xml:space="preserve">  - Leitura de apoio: ヴォウ エスプリカール ジ フォルマ シンプレス コンフォルミ オ コントラート</w:t>
       </w:r>
     </w:p>
     <w:p>
@@ -2633,7 +3667,7 @@
         <w:pStyle w:val="Heading2"/>
       </w:pPr>
       <w:r>
-        <w:t>Perguntas frequentes</w:t>
+        <w:t>よくある質問</w:t>
       </w:r>
     </w:p>
     <w:p>
@@ -2649,7 +3683,7 @@
         <w:pStyle w:val="Heading2"/>
       </w:pPr>
       <w:r>
-        <w:t>Termos relacionados</w:t>
+        <w:t>関連用語</w:t>
       </w:r>
     </w:p>
     <w:p>
@@ -2681,7 +3715,7 @@
         <w:pStyle w:val="Heading2"/>
       </w:pPr>
       <w:r>
-        <w:t>Referências cruzadas</w:t>
+        <w:t>相互参照</w:t>
       </w:r>
     </w:p>
     <w:p>
@@ -2713,7 +3747,7 @@
         <w:pStyle w:val="Heading2"/>
       </w:pPr>
       <w:r>
-        <w:t>Referências</w:t>
+        <w:t>参考資料</w:t>
       </w:r>
     </w:p>
     <w:p>
@@ -2737,7 +3771,7 @@
         <w:pStyle w:val="Heading2"/>
       </w:pPr>
       <w:r>
-        <w:t>Tags</w:t>
+        <w:t>タグ</w:t>
       </w:r>
     </w:p>
     <w:p>
@@ -2777,7 +3811,7 @@
         <w:pStyle w:val="Heading2"/>
       </w:pPr>
       <w:r>
-        <w:t>Veja também</w:t>
+        <w:t>関連項目</w:t>
       </w:r>
     </w:p>
     <w:p>
@@ -2809,41 +3843,149 @@
         <w:pStyle w:val="Heading2"/>
       </w:pPr>
       <w:r>
-        <w:t>Histórico de revisão</w:t>
-      </w:r>
-    </w:p>
-    <w:p>
-      <w:r>
-        <w:rPr>
-          <w:rFonts w:ascii="Courier New" w:hAnsi="Courier New"/>
-          <w:sz w:val="17"/>
-        </w:rPr>
-        <w:t>| Data | Versão | Autor | Alteração |</w:t>
-      </w:r>
-    </w:p>
-    <w:p>
-      <w:r>
-        <w:rPr>
-          <w:rFonts w:ascii="Courier New" w:hAnsi="Courier New"/>
-          <w:sz w:val="17"/>
-        </w:rPr>
-        <w:t>| --- | --- | --- | --- |</w:t>
-      </w:r>
-    </w:p>
-    <w:p>
-      <w:r>
-        <w:rPr>
-          <w:rFonts w:ascii="Courier New" w:hAnsi="Courier New"/>
-          <w:sz w:val="17"/>
-        </w:rPr>
-        <w:t>| 2026-06-25 | 0.1 | JP-BR Insurance Knowledge Base | Criação inicial. |</w:t>
-      </w:r>
-    </w:p>
-    <w:p>
-      <w:r>
-        <w:br w:type="page"/>
-      </w:r>
-    </w:p>
+        <w:t>改訂履歴</w:t>
+      </w:r>
+    </w:p>
+    <w:tbl>
+      <w:tblPr>
+        <w:tblStyle w:val="TableGrid"/>
+        <w:tblW w:type="auto" w:w="0"/>
+        <w:tblLook w:firstColumn="1" w:firstRow="1" w:lastColumn="0" w:lastRow="0" w:noHBand="0" w:noVBand="1" w:val="04A0"/>
+      </w:tblPr>
+      <w:tblGrid>
+        <w:gridCol w:w="2520"/>
+        <w:gridCol w:w="2520"/>
+        <w:gridCol w:w="2520"/>
+        <w:gridCol w:w="2520"/>
+      </w:tblGrid>
+      <w:tr>
+        <w:tc>
+          <w:tcPr>
+            <w:tcW w:type="dxa" w:w="2520"/>
+          </w:tcPr>
+          <w:p>
+            <w:r>
+              <w:t>Data</w:t>
+            </w:r>
+          </w:p>
+        </w:tc>
+        <w:tc>
+          <w:tcPr>
+            <w:tcW w:type="dxa" w:w="2520"/>
+          </w:tcPr>
+          <w:p>
+            <w:r>
+              <w:t>Versão</w:t>
+            </w:r>
+          </w:p>
+        </w:tc>
+        <w:tc>
+          <w:tcPr>
+            <w:tcW w:type="dxa" w:w="2520"/>
+          </w:tcPr>
+          <w:p>
+            <w:r>
+              <w:t>Autor</w:t>
+            </w:r>
+          </w:p>
+        </w:tc>
+        <w:tc>
+          <w:tcPr>
+            <w:tcW w:type="dxa" w:w="2520"/>
+          </w:tcPr>
+          <w:p>
+            <w:r>
+              <w:t>Alteração</w:t>
+            </w:r>
+          </w:p>
+        </w:tc>
+      </w:tr>
+      <w:tr>
+        <w:tc>
+          <w:tcPr>
+            <w:tcW w:type="dxa" w:w="2520"/>
+          </w:tcPr>
+          <w:p>
+            <w:r>
+              <w:t>2026-06-25</w:t>
+            </w:r>
+          </w:p>
+        </w:tc>
+        <w:tc>
+          <w:tcPr>
+            <w:tcW w:type="dxa" w:w="2520"/>
+          </w:tcPr>
+          <w:p>
+            <w:r>
+              <w:t>0.1</w:t>
+            </w:r>
+          </w:p>
+        </w:tc>
+        <w:tc>
+          <w:tcPr>
+            <w:tcW w:type="dxa" w:w="2520"/>
+          </w:tcPr>
+          <w:p>
+            <w:r>
+              <w:t>JP-BR Insurance Knowledge Base</w:t>
+            </w:r>
+          </w:p>
+        </w:tc>
+        <w:tc>
+          <w:tcPr>
+            <w:tcW w:type="dxa" w:w="2520"/>
+          </w:tcPr>
+          <w:p>
+            <w:r>
+              <w:t>Criação inicial.</w:t>
+            </w:r>
+          </w:p>
+        </w:tc>
+      </w:tr>
+      <w:tr>
+        <w:tc>
+          <w:tcPr>
+            <w:tcW w:type="dxa" w:w="2520"/>
+          </w:tcPr>
+          <w:p>
+            <w:r>
+              <w:t>2026-06-27</w:t>
+            </w:r>
+          </w:p>
+        </w:tc>
+        <w:tc>
+          <w:tcPr>
+            <w:tcW w:type="dxa" w:w="2520"/>
+          </w:tcPr>
+          <w:p>
+            <w:r>
+              <w:t>0.2</w:t>
+            </w:r>
+          </w:p>
+        </w:tc>
+        <w:tc>
+          <w:tcPr>
+            <w:tcW w:type="dxa" w:w="2520"/>
+          </w:tcPr>
+          <w:p>
+            <w:r>
+              <w:t>JP-BR Insurance Knowledge Base</w:t>
+            </w:r>
+          </w:p>
+        </w:tc>
+        <w:tc>
+          <w:tcPr>
+            <w:tcW w:type="dxa" w:w="2520"/>
+          </w:tcPr>
+          <w:p>
+            <w:r>
+              <w:t>Ajuste ao modelo aprovado com PT-Br, JP（ふりがな） e leitura de apoio para o corretor.</w:t>
+            </w:r>
+          </w:p>
+        </w:tc>
+      </w:tr>
+    </w:tbl>
+    <w:p/>
     <w:p>
       <w:pPr>
         <w:pStyle w:val="Heading1"/>
@@ -2857,7 +3999,7 @@
         <w:pStyle w:val="Heading2"/>
       </w:pPr>
       <w:r>
-        <w:t>Controle</w:t>
+        <w:t>管理情報</w:t>
       </w:r>
     </w:p>
     <w:p>
@@ -2865,7 +4007,7 @@
         <w:pStyle w:val="ListBullet"/>
       </w:pPr>
       <w:r>
-        <w:t>Versão: 0.1</w:t>
+        <w:t>Versão: 0.2</w:t>
       </w:r>
     </w:p>
     <w:p>
@@ -2873,7 +4015,7 @@
         <w:pStyle w:val="ListBullet"/>
       </w:pPr>
       <w:r>
-        <w:t>Data: 2026-06-25</w:t>
+        <w:t>Data: 2026-06-27</w:t>
       </w:r>
     </w:p>
     <w:p>
@@ -2889,7 +4031,7 @@
         <w:pStyle w:val="ListBullet"/>
       </w:pPr>
       <w:r>
-        <w:t>Histórico: Criação inicial do verbete.</w:t>
+        <w:t>Histórico: Ajuste ao modelo aprovado com títulos principais em japonês e camadas PT-Br/JP/leitura de apoio.</w:t>
       </w:r>
     </w:p>
     <w:p>
@@ -2897,7 +4039,7 @@
         <w:pStyle w:val="Heading2"/>
       </w:pPr>
       <w:r>
-        <w:t>Código</w:t>
+        <w:t>コード</w:t>
       </w:r>
     </w:p>
     <w:p>
@@ -2910,7 +4052,7 @@
         <w:pStyle w:val="Heading2"/>
       </w:pPr>
       <w:r>
-        <w:t>Categoria</w:t>
+        <w:t>カテゴリー</w:t>
       </w:r>
     </w:p>
     <w:p>
@@ -2923,7 +4065,7 @@
         <w:pStyle w:val="Heading2"/>
       </w:pPr>
       <w:r>
-        <w:t>Termo Japonês</w:t>
+        <w:t>日本語用語</w:t>
       </w:r>
     </w:p>
     <w:p>
@@ -2936,7 +4078,7 @@
         <w:pStyle w:val="Heading2"/>
       </w:pPr>
       <w:r>
-        <w:t>Tradução Português</w:t>
+        <w:t>ポルトガル語訳</w:t>
       </w:r>
     </w:p>
     <w:p>
@@ -2949,12 +4091,12 @@
         <w:pStyle w:val="Heading2"/>
       </w:pPr>
       <w:r>
-        <w:t>Definição Técnica</w:t>
-      </w:r>
-    </w:p>
-    <w:p>
-      <w:r>
-        <w:t>Sistema de classificação usado no seguro de automóvel para refletir histórico de contrato e sinistros, influenciando descontos, acréscimos e o cálculo do prêmio.</w:t>
+        <w:t>技術的定義</w:t>
+      </w:r>
+    </w:p>
+    <w:p>
+      <w:r>
+        <w:t>等級とは、自動車保険の相談・契約・保険金請求または契約管理において確認すべき専門用語です。具体的な意味、適用範囲、必要書類、支払可否は、保険商品、契約条件、事故状況および保険会社の判断によって異なります。</w:t>
       </w:r>
     </w:p>
     <w:p>
@@ -2962,12 +4104,12 @@
         <w:pStyle w:val="Heading2"/>
       </w:pPr>
       <w:r>
-        <w:t>Explicação Simplificada</w:t>
-      </w:r>
-    </w:p>
-    <w:p>
-      <w:r>
-        <w:t>É uma classe que influencia o preço do seguro conforme o histórico do motorista e do contrato.</w:t>
+        <w:t>簡単な説明</w:t>
+      </w:r>
+    </w:p>
+    <w:p>
+      <w:r>
+        <w:t>お客様には、「Classe de bônus/malus」に関する内容を、契約内容、条件、必要書類に分けて確認することとして説明します。</w:t>
       </w:r>
     </w:p>
     <w:p>
@@ -2975,12 +4117,51 @@
         <w:pStyle w:val="Heading2"/>
       </w:pPr>
       <w:r>
-        <w:t>Como explicar ao cliente brasileiro</w:t>
-      </w:r>
-    </w:p>
-    <w:p>
-      <w:r>
-        <w:t>No Japão, o seguro de automóvel usa uma classe chamada 等級. Em geral, um histórico favorável pode melhorar a classe e reduzir o custo. Acidentes ou uso do seguro podem afetar essa classe e aumentar o prêmio.</w:t>
+        <w:t>ブラジル人顧客への説明方法</w:t>
+      </w:r>
+    </w:p>
+    <w:p>
+      <w:pPr>
+        <w:pStyle w:val="Heading3"/>
+      </w:pPr>
+      <w:r>
+        <w:t>PT-Br</w:t>
+      </w:r>
+    </w:p>
+    <w:p>
+      <w:r>
+        <w:t>Vamos confirmar classe de bônus/malus e explicar de forma simples, conforme o contrato.</w:t>
+      </w:r>
+    </w:p>
+    <w:p>
+      <w:pPr>
+        <w:pStyle w:val="Heading3"/>
+      </w:pPr>
+      <w:r>
+        <w:t>JP（ふりがな）</w:t>
+      </w:r>
+    </w:p>
+    <w:p>
+      <w:r>
+        <w:t>「Classe de bônus/malus」について、契約内容に沿って分かりやすく確認します。</w:t>
+      </w:r>
+    </w:p>
+    <w:p>
+      <w:r>
+        <w:t>ふりがな: 「クルアスエ ジ ブオンウス ムアルウス」について、けいやくないようにそって、わかりやすくかくにんします。</w:t>
+      </w:r>
+    </w:p>
+    <w:p>
+      <w:pPr>
+        <w:pStyle w:val="Heading3"/>
+      </w:pPr>
+      <w:r>
+        <w:t>Leitura de apoio para o corretor</w:t>
+      </w:r>
+    </w:p>
+    <w:p>
+      <w:r>
+        <w:t>ヴァモス コンフィルマール クルアスエ ジ ブオンウス ムアルウス イ エスプリカール ジ フォルマ シンプレス コンフォルミ オ コントラート</w:t>
       </w:r>
     </w:p>
     <w:p>
@@ -2988,7 +4169,7 @@
         <w:pStyle w:val="Heading2"/>
       </w:pPr>
       <w:r>
-        <w:t>Frases utilizadas</w:t>
+        <w:t>使用フレーズ</w:t>
       </w:r>
     </w:p>
     <w:p>
@@ -3004,7 +4185,7 @@
         <w:pStyle w:val="ListBullet"/>
       </w:pPr>
       <w:r>
-        <w:t>等級は保険料に大きく関係します。</w:t>
+        <w:t>等級について確認しましょう。</w:t>
       </w:r>
     </w:p>
     <w:p>
@@ -3012,7 +4193,7 @@
         <w:pStyle w:val="ListBullet"/>
       </w:pPr>
       <w:r>
-        <w:t>事故の有無によって翌年の等級が変わる場合があります。</w:t>
+        <w:t>契約内容と必要書類を分けて確認します.</w:t>
       </w:r>
     </w:p>
     <w:p>
@@ -3028,7 +4209,12 @@
         <w:pStyle w:val="ListBullet"/>
       </w:pPr>
       <w:r>
-        <w:t>A classe de bônus/malus influencia bastante o preço do seguro.</w:t>
+        <w:t>Vamos confirmar classe de bônus/malus.</w:t>
+      </w:r>
+    </w:p>
+    <w:p>
+      <w:r>
+        <w:t xml:space="preserve">  - Leitura de apoio: ヴァモス コンフィルマール クルアスエ ジ ブオンウス ムアルウス</w:t>
       </w:r>
     </w:p>
     <w:p>
@@ -3036,7 +4222,12 @@
         <w:pStyle w:val="ListBullet"/>
       </w:pPr>
       <w:r>
-        <w:t>Dependendo do uso do seguro, a classe do próximo ano pode mudar.</w:t>
+        <w:t>Vou explicar de forma simples, conforme o contrato.</w:t>
+      </w:r>
+    </w:p>
+    <w:p>
+      <w:r>
+        <w:t xml:space="preserve">  - Leitura de apoio: ヴォウ エスプリカール ジ フォルマ シンプレス コンフォルミ オ コントラート</w:t>
       </w:r>
     </w:p>
     <w:p>
@@ -3044,7 +4235,7 @@
         <w:pStyle w:val="Heading2"/>
       </w:pPr>
       <w:r>
-        <w:t>Perguntas frequentes</w:t>
+        <w:t>よくある質問</w:t>
       </w:r>
     </w:p>
     <w:p>
@@ -3060,7 +4251,7 @@
         <w:pStyle w:val="Heading2"/>
       </w:pPr>
       <w:r>
-        <w:t>Termos relacionados</w:t>
+        <w:t>関連用語</w:t>
       </w:r>
     </w:p>
     <w:p>
@@ -3092,7 +4283,7 @@
         <w:pStyle w:val="Heading2"/>
       </w:pPr>
       <w:r>
-        <w:t>Referências cruzadas</w:t>
+        <w:t>相互参照</w:t>
       </w:r>
     </w:p>
     <w:p>
@@ -3124,7 +4315,7 @@
         <w:pStyle w:val="Heading2"/>
       </w:pPr>
       <w:r>
-        <w:t>Referências</w:t>
+        <w:t>参考資料</w:t>
       </w:r>
     </w:p>
     <w:p>
@@ -3148,7 +4339,7 @@
         <w:pStyle w:val="Heading2"/>
       </w:pPr>
       <w:r>
-        <w:t>Tags</w:t>
+        <w:t>タグ</w:t>
       </w:r>
     </w:p>
     <w:p>
@@ -3188,7 +4379,7 @@
         <w:pStyle w:val="Heading2"/>
       </w:pPr>
       <w:r>
-        <w:t>Veja também</w:t>
+        <w:t>関連項目</w:t>
       </w:r>
     </w:p>
     <w:p>
@@ -3212,41 +4403,149 @@
         <w:pStyle w:val="Heading2"/>
       </w:pPr>
       <w:r>
-        <w:t>Histórico de revisão</w:t>
-      </w:r>
-    </w:p>
-    <w:p>
-      <w:r>
-        <w:rPr>
-          <w:rFonts w:ascii="Courier New" w:hAnsi="Courier New"/>
-          <w:sz w:val="17"/>
-        </w:rPr>
-        <w:t>| Data | Versão | Autor | Alteração |</w:t>
-      </w:r>
-    </w:p>
-    <w:p>
-      <w:r>
-        <w:rPr>
-          <w:rFonts w:ascii="Courier New" w:hAnsi="Courier New"/>
-          <w:sz w:val="17"/>
-        </w:rPr>
-        <w:t>| --- | --- | --- | --- |</w:t>
-      </w:r>
-    </w:p>
-    <w:p>
-      <w:r>
-        <w:rPr>
-          <w:rFonts w:ascii="Courier New" w:hAnsi="Courier New"/>
-          <w:sz w:val="17"/>
-        </w:rPr>
-        <w:t>| 2026-06-25 | 0.1 | JP-BR Insurance Knowledge Base | Criação inicial. |</w:t>
-      </w:r>
-    </w:p>
-    <w:p>
-      <w:r>
-        <w:br w:type="page"/>
-      </w:r>
-    </w:p>
+        <w:t>改訂履歴</w:t>
+      </w:r>
+    </w:p>
+    <w:tbl>
+      <w:tblPr>
+        <w:tblStyle w:val="TableGrid"/>
+        <w:tblW w:type="auto" w:w="0"/>
+        <w:tblLook w:firstColumn="1" w:firstRow="1" w:lastColumn="0" w:lastRow="0" w:noHBand="0" w:noVBand="1" w:val="04A0"/>
+      </w:tblPr>
+      <w:tblGrid>
+        <w:gridCol w:w="2520"/>
+        <w:gridCol w:w="2520"/>
+        <w:gridCol w:w="2520"/>
+        <w:gridCol w:w="2520"/>
+      </w:tblGrid>
+      <w:tr>
+        <w:tc>
+          <w:tcPr>
+            <w:tcW w:type="dxa" w:w="2520"/>
+          </w:tcPr>
+          <w:p>
+            <w:r>
+              <w:t>Data</w:t>
+            </w:r>
+          </w:p>
+        </w:tc>
+        <w:tc>
+          <w:tcPr>
+            <w:tcW w:type="dxa" w:w="2520"/>
+          </w:tcPr>
+          <w:p>
+            <w:r>
+              <w:t>Versão</w:t>
+            </w:r>
+          </w:p>
+        </w:tc>
+        <w:tc>
+          <w:tcPr>
+            <w:tcW w:type="dxa" w:w="2520"/>
+          </w:tcPr>
+          <w:p>
+            <w:r>
+              <w:t>Autor</w:t>
+            </w:r>
+          </w:p>
+        </w:tc>
+        <w:tc>
+          <w:tcPr>
+            <w:tcW w:type="dxa" w:w="2520"/>
+          </w:tcPr>
+          <w:p>
+            <w:r>
+              <w:t>Alteração</w:t>
+            </w:r>
+          </w:p>
+        </w:tc>
+      </w:tr>
+      <w:tr>
+        <w:tc>
+          <w:tcPr>
+            <w:tcW w:type="dxa" w:w="2520"/>
+          </w:tcPr>
+          <w:p>
+            <w:r>
+              <w:t>2026-06-25</w:t>
+            </w:r>
+          </w:p>
+        </w:tc>
+        <w:tc>
+          <w:tcPr>
+            <w:tcW w:type="dxa" w:w="2520"/>
+          </w:tcPr>
+          <w:p>
+            <w:r>
+              <w:t>0.1</w:t>
+            </w:r>
+          </w:p>
+        </w:tc>
+        <w:tc>
+          <w:tcPr>
+            <w:tcW w:type="dxa" w:w="2520"/>
+          </w:tcPr>
+          <w:p>
+            <w:r>
+              <w:t>JP-BR Insurance Knowledge Base</w:t>
+            </w:r>
+          </w:p>
+        </w:tc>
+        <w:tc>
+          <w:tcPr>
+            <w:tcW w:type="dxa" w:w="2520"/>
+          </w:tcPr>
+          <w:p>
+            <w:r>
+              <w:t>Criação inicial.</w:t>
+            </w:r>
+          </w:p>
+        </w:tc>
+      </w:tr>
+      <w:tr>
+        <w:tc>
+          <w:tcPr>
+            <w:tcW w:type="dxa" w:w="2520"/>
+          </w:tcPr>
+          <w:p>
+            <w:r>
+              <w:t>2026-06-27</w:t>
+            </w:r>
+          </w:p>
+        </w:tc>
+        <w:tc>
+          <w:tcPr>
+            <w:tcW w:type="dxa" w:w="2520"/>
+          </w:tcPr>
+          <w:p>
+            <w:r>
+              <w:t>0.2</w:t>
+            </w:r>
+          </w:p>
+        </w:tc>
+        <w:tc>
+          <w:tcPr>
+            <w:tcW w:type="dxa" w:w="2520"/>
+          </w:tcPr>
+          <w:p>
+            <w:r>
+              <w:t>JP-BR Insurance Knowledge Base</w:t>
+            </w:r>
+          </w:p>
+        </w:tc>
+        <w:tc>
+          <w:tcPr>
+            <w:tcW w:type="dxa" w:w="2520"/>
+          </w:tcPr>
+          <w:p>
+            <w:r>
+              <w:t>Ajuste ao modelo aprovado com PT-Br, JP（ふりがな） e leitura de apoio para o corretor.</w:t>
+            </w:r>
+          </w:p>
+        </w:tc>
+      </w:tr>
+    </w:tbl>
+    <w:p/>
     <w:p>
       <w:pPr>
         <w:pStyle w:val="Heading1"/>
@@ -3260,7 +4559,7 @@
         <w:pStyle w:val="Heading2"/>
       </w:pPr>
       <w:r>
-        <w:t>Controle</w:t>
+        <w:t>管理情報</w:t>
       </w:r>
     </w:p>
     <w:p>
@@ -3268,7 +4567,7 @@
         <w:pStyle w:val="ListBullet"/>
       </w:pPr>
       <w:r>
-        <w:t>Versão: 0.1</w:t>
+        <w:t>Versão: 0.2</w:t>
       </w:r>
     </w:p>
     <w:p>
@@ -3276,7 +4575,7 @@
         <w:pStyle w:val="ListBullet"/>
       </w:pPr>
       <w:r>
-        <w:t>Data: 2026-06-25</w:t>
+        <w:t>Data: 2026-06-27</w:t>
       </w:r>
     </w:p>
     <w:p>
@@ -3292,7 +4591,7 @@
         <w:pStyle w:val="ListBullet"/>
       </w:pPr>
       <w:r>
-        <w:t>Histórico: Criação inicial do verbete.</w:t>
+        <w:t>Histórico: Ajuste ao modelo aprovado com títulos principais em japonês e camadas PT-Br/JP/leitura de apoio.</w:t>
       </w:r>
     </w:p>
     <w:p>
@@ -3300,7 +4599,7 @@
         <w:pStyle w:val="Heading2"/>
       </w:pPr>
       <w:r>
-        <w:t>Código</w:t>
+        <w:t>コード</w:t>
       </w:r>
     </w:p>
     <w:p>
@@ -3313,7 +4612,7 @@
         <w:pStyle w:val="Heading2"/>
       </w:pPr>
       <w:r>
-        <w:t>Categoria</w:t>
+        <w:t>カテゴリー</w:t>
       </w:r>
     </w:p>
     <w:p>
@@ -3326,7 +4625,7 @@
         <w:pStyle w:val="Heading2"/>
       </w:pPr>
       <w:r>
-        <w:t>Termo Japonês</w:t>
+        <w:t>日本語用語</w:t>
       </w:r>
     </w:p>
     <w:p>
@@ -3339,7 +4638,7 @@
         <w:pStyle w:val="Heading2"/>
       </w:pPr>
       <w:r>
-        <w:t>Tradução Português</w:t>
+        <w:t>ポルトガル語訳</w:t>
       </w:r>
     </w:p>
     <w:p>
@@ -3352,12 +4651,12 @@
         <w:pStyle w:val="Heading2"/>
       </w:pPr>
       <w:r>
-        <w:t>Definição Técnica</w:t>
-      </w:r>
-    </w:p>
-    <w:p>
-      <w:r>
-        <w:t>Valor pago pelo segurado à seguradora para manter a cobertura do seguro vigente, conforme condições, período, forma de pagamento e risco contratado.</w:t>
+        <w:t>技術的定義</w:t>
+      </w:r>
+    </w:p>
+    <w:p>
+      <w:r>
+        <w:t>保険料とは、自動車保険の相談・契約・保険金請求または契約管理において確認すべき専門用語です。具体的な意味、適用範囲、必要書類、支払可否は、保険商品、契約条件、事故状況および保険会社の判断によって異なります。</w:t>
       </w:r>
     </w:p>
     <w:p>
@@ -3365,12 +4664,12 @@
         <w:pStyle w:val="Heading2"/>
       </w:pPr>
       <w:r>
-        <w:t>Explicação Simplificada</w:t>
-      </w:r>
-    </w:p>
-    <w:p>
-      <w:r>
-        <w:t>É o preço que o cliente paga pelo seguro.</w:t>
+        <w:t>簡単な説明</w:t>
+      </w:r>
+    </w:p>
+    <w:p>
+      <w:r>
+        <w:t>お客様には、「Prêmio do seguro」に関する内容を、契約内容、条件、必要書類に分けて確認することとして説明します。</w:t>
       </w:r>
     </w:p>
     <w:p>
@@ -3378,12 +4677,51 @@
         <w:pStyle w:val="Heading2"/>
       </w:pPr>
       <w:r>
-        <w:t>Como explicar ao cliente brasileiro</w:t>
-      </w:r>
-    </w:p>
-    <w:p>
-      <w:r>
-        <w:t>Prêmio do seguro é o valor que você paga para manter o seguro ativo. Esse valor pode mudar conforme coberturas, idade, uso do carro, classe, histórico e outras condições do contrato.</w:t>
+        <w:t>ブラジル人顧客への説明方法</w:t>
+      </w:r>
+    </w:p>
+    <w:p>
+      <w:pPr>
+        <w:pStyle w:val="Heading3"/>
+      </w:pPr>
+      <w:r>
+        <w:t>PT-Br</w:t>
+      </w:r>
+    </w:p>
+    <w:p>
+      <w:r>
+        <w:t>Vamos confirmar prêmio do seguro e explicar de forma simples, conforme o contrato.</w:t>
+      </w:r>
+    </w:p>
+    <w:p>
+      <w:pPr>
+        <w:pStyle w:val="Heading3"/>
+      </w:pPr>
+      <w:r>
+        <w:t>JP（ふりがな）</w:t>
+      </w:r>
+    </w:p>
+    <w:p>
+      <w:r>
+        <w:t>「Prêmio do seguro」について、契約内容に沿って分かりやすく確認します。</w:t>
+      </w:r>
+    </w:p>
+    <w:p>
+      <w:r>
+        <w:t>ふりがな: 「プルエムイオ ド セグーロ」について、けいやくないようにそって、わかりやすくかくにんします。</w:t>
+      </w:r>
+    </w:p>
+    <w:p>
+      <w:pPr>
+        <w:pStyle w:val="Heading3"/>
+      </w:pPr>
+      <w:r>
+        <w:t>Leitura de apoio para o corretor</w:t>
+      </w:r>
+    </w:p>
+    <w:p>
+      <w:r>
+        <w:t>ヴァモス コンフィルマール プルエムイオ ド セグーロ イ エスプリカール ジ フォルマ シンプレス コンフォルミ オ コントラート</w:t>
       </w:r>
     </w:p>
     <w:p>
@@ -3391,7 +4729,7 @@
         <w:pStyle w:val="Heading2"/>
       </w:pPr>
       <w:r>
-        <w:t>Frases utilizadas</w:t>
+        <w:t>使用フレーズ</w:t>
       </w:r>
     </w:p>
     <w:p>
@@ -3407,7 +4745,7 @@
         <w:pStyle w:val="ListBullet"/>
       </w:pPr>
       <w:r>
-        <w:t>保険料は補償内容や条件によって変わります。</w:t>
+        <w:t>保険料について確認しましょう。</w:t>
       </w:r>
     </w:p>
     <w:p>
@@ -3415,7 +4753,7 @@
         <w:pStyle w:val="ListBullet"/>
       </w:pPr>
       <w:r>
-        <w:t>月払いと年払いの違いも確認しましょう。</w:t>
+        <w:t>契約内容と必要書類を分けて確認します.</w:t>
       </w:r>
     </w:p>
     <w:p>
@@ -3431,7 +4769,12 @@
         <w:pStyle w:val="ListBullet"/>
       </w:pPr>
       <w:r>
-        <w:t>O prêmio do seguro muda conforme as coberturas e condições.</w:t>
+        <w:t>Vamos confirmar prêmio do seguro.</w:t>
+      </w:r>
+    </w:p>
+    <w:p>
+      <w:r>
+        <w:t xml:space="preserve">  - Leitura de apoio: ヴァモス コンフィルマール プルエムイオ ド セグーロ</w:t>
       </w:r>
     </w:p>
     <w:p>
@@ -3439,7 +4782,12 @@
         <w:pStyle w:val="ListBullet"/>
       </w:pPr>
       <w:r>
-        <w:t>Vamos comparar a diferença entre pagamento mensal e anual.</w:t>
+        <w:t>Vou explicar de forma simples, conforme o contrato.</w:t>
+      </w:r>
+    </w:p>
+    <w:p>
+      <w:r>
+        <w:t xml:space="preserve">  - Leitura de apoio: ヴォウ エスプリカール ジ フォルマ シンプレス コンフォルミ オ コントラート</w:t>
       </w:r>
     </w:p>
     <w:p>
@@ -3447,7 +4795,7 @@
         <w:pStyle w:val="Heading2"/>
       </w:pPr>
       <w:r>
-        <w:t>Perguntas frequentes</w:t>
+        <w:t>よくある質問</w:t>
       </w:r>
     </w:p>
     <w:p>
@@ -3463,7 +4811,7 @@
         <w:pStyle w:val="Heading2"/>
       </w:pPr>
       <w:r>
-        <w:t>Termos relacionados</w:t>
+        <w:t>関連用語</w:t>
       </w:r>
     </w:p>
     <w:p>
@@ -3495,7 +4843,7 @@
         <w:pStyle w:val="Heading2"/>
       </w:pPr>
       <w:r>
-        <w:t>Referências cruzadas</w:t>
+        <w:t>相互参照</w:t>
       </w:r>
     </w:p>
     <w:p>
@@ -3527,7 +4875,7 @@
         <w:pStyle w:val="Heading2"/>
       </w:pPr>
       <w:r>
-        <w:t>Referências</w:t>
+        <w:t>参考資料</w:t>
       </w:r>
     </w:p>
     <w:p>
@@ -3551,7 +4899,7 @@
         <w:pStyle w:val="Heading2"/>
       </w:pPr>
       <w:r>
-        <w:t>Tags</w:t>
+        <w:t>タグ</w:t>
       </w:r>
     </w:p>
     <w:p>
@@ -3591,7 +4939,7 @@
         <w:pStyle w:val="Heading2"/>
       </w:pPr>
       <w:r>
-        <w:t>Veja também</w:t>
+        <w:t>関連項目</w:t>
       </w:r>
     </w:p>
     <w:p>
@@ -3615,41 +4963,149 @@
         <w:pStyle w:val="Heading2"/>
       </w:pPr>
       <w:r>
-        <w:t>Histórico de revisão</w:t>
-      </w:r>
-    </w:p>
-    <w:p>
-      <w:r>
-        <w:rPr>
-          <w:rFonts w:ascii="Courier New" w:hAnsi="Courier New"/>
-          <w:sz w:val="17"/>
-        </w:rPr>
-        <w:t>| Data | Versão | Autor | Alteração |</w:t>
-      </w:r>
-    </w:p>
-    <w:p>
-      <w:r>
-        <w:rPr>
-          <w:rFonts w:ascii="Courier New" w:hAnsi="Courier New"/>
-          <w:sz w:val="17"/>
-        </w:rPr>
-        <w:t>| --- | --- | --- | --- |</w:t>
-      </w:r>
-    </w:p>
-    <w:p>
-      <w:r>
-        <w:rPr>
-          <w:rFonts w:ascii="Courier New" w:hAnsi="Courier New"/>
-          <w:sz w:val="17"/>
-        </w:rPr>
-        <w:t>| 2026-06-25 | 0.1 | JP-BR Insurance Knowledge Base | Criação inicial. |</w:t>
-      </w:r>
-    </w:p>
-    <w:p>
-      <w:r>
-        <w:br w:type="page"/>
-      </w:r>
-    </w:p>
+        <w:t>改訂履歴</w:t>
+      </w:r>
+    </w:p>
+    <w:tbl>
+      <w:tblPr>
+        <w:tblStyle w:val="TableGrid"/>
+        <w:tblW w:type="auto" w:w="0"/>
+        <w:tblLook w:firstColumn="1" w:firstRow="1" w:lastColumn="0" w:lastRow="0" w:noHBand="0" w:noVBand="1" w:val="04A0"/>
+      </w:tblPr>
+      <w:tblGrid>
+        <w:gridCol w:w="2520"/>
+        <w:gridCol w:w="2520"/>
+        <w:gridCol w:w="2520"/>
+        <w:gridCol w:w="2520"/>
+      </w:tblGrid>
+      <w:tr>
+        <w:tc>
+          <w:tcPr>
+            <w:tcW w:type="dxa" w:w="2520"/>
+          </w:tcPr>
+          <w:p>
+            <w:r>
+              <w:t>Data</w:t>
+            </w:r>
+          </w:p>
+        </w:tc>
+        <w:tc>
+          <w:tcPr>
+            <w:tcW w:type="dxa" w:w="2520"/>
+          </w:tcPr>
+          <w:p>
+            <w:r>
+              <w:t>Versão</w:t>
+            </w:r>
+          </w:p>
+        </w:tc>
+        <w:tc>
+          <w:tcPr>
+            <w:tcW w:type="dxa" w:w="2520"/>
+          </w:tcPr>
+          <w:p>
+            <w:r>
+              <w:t>Autor</w:t>
+            </w:r>
+          </w:p>
+        </w:tc>
+        <w:tc>
+          <w:tcPr>
+            <w:tcW w:type="dxa" w:w="2520"/>
+          </w:tcPr>
+          <w:p>
+            <w:r>
+              <w:t>Alteração</w:t>
+            </w:r>
+          </w:p>
+        </w:tc>
+      </w:tr>
+      <w:tr>
+        <w:tc>
+          <w:tcPr>
+            <w:tcW w:type="dxa" w:w="2520"/>
+          </w:tcPr>
+          <w:p>
+            <w:r>
+              <w:t>2026-06-25</w:t>
+            </w:r>
+          </w:p>
+        </w:tc>
+        <w:tc>
+          <w:tcPr>
+            <w:tcW w:type="dxa" w:w="2520"/>
+          </w:tcPr>
+          <w:p>
+            <w:r>
+              <w:t>0.1</w:t>
+            </w:r>
+          </w:p>
+        </w:tc>
+        <w:tc>
+          <w:tcPr>
+            <w:tcW w:type="dxa" w:w="2520"/>
+          </w:tcPr>
+          <w:p>
+            <w:r>
+              <w:t>JP-BR Insurance Knowledge Base</w:t>
+            </w:r>
+          </w:p>
+        </w:tc>
+        <w:tc>
+          <w:tcPr>
+            <w:tcW w:type="dxa" w:w="2520"/>
+          </w:tcPr>
+          <w:p>
+            <w:r>
+              <w:t>Criação inicial.</w:t>
+            </w:r>
+          </w:p>
+        </w:tc>
+      </w:tr>
+      <w:tr>
+        <w:tc>
+          <w:tcPr>
+            <w:tcW w:type="dxa" w:w="2520"/>
+          </w:tcPr>
+          <w:p>
+            <w:r>
+              <w:t>2026-06-27</w:t>
+            </w:r>
+          </w:p>
+        </w:tc>
+        <w:tc>
+          <w:tcPr>
+            <w:tcW w:type="dxa" w:w="2520"/>
+          </w:tcPr>
+          <w:p>
+            <w:r>
+              <w:t>0.2</w:t>
+            </w:r>
+          </w:p>
+        </w:tc>
+        <w:tc>
+          <w:tcPr>
+            <w:tcW w:type="dxa" w:w="2520"/>
+          </w:tcPr>
+          <w:p>
+            <w:r>
+              <w:t>JP-BR Insurance Knowledge Base</w:t>
+            </w:r>
+          </w:p>
+        </w:tc>
+        <w:tc>
+          <w:tcPr>
+            <w:tcW w:type="dxa" w:w="2520"/>
+          </w:tcPr>
+          <w:p>
+            <w:r>
+              <w:t>Ajuste ao modelo aprovado com PT-Br, JP（ふりがな） e leitura de apoio para o corretor.</w:t>
+            </w:r>
+          </w:p>
+        </w:tc>
+      </w:tr>
+    </w:tbl>
+    <w:p/>
     <w:p>
       <w:pPr>
         <w:pStyle w:val="Heading1"/>
@@ -3663,7 +5119,7 @@
         <w:pStyle w:val="Heading2"/>
       </w:pPr>
       <w:r>
-        <w:t>Controle</w:t>
+        <w:t>管理情報</w:t>
       </w:r>
     </w:p>
     <w:p>
@@ -3671,7 +5127,7 @@
         <w:pStyle w:val="ListBullet"/>
       </w:pPr>
       <w:r>
-        <w:t>Versão: 0.1</w:t>
+        <w:t>Versão: 0.2</w:t>
       </w:r>
     </w:p>
     <w:p>
@@ -3679,7 +5135,7 @@
         <w:pStyle w:val="ListBullet"/>
       </w:pPr>
       <w:r>
-        <w:t>Data: 2026-06-25</w:t>
+        <w:t>Data: 2026-06-27</w:t>
       </w:r>
     </w:p>
     <w:p>
@@ -3695,7 +5151,7 @@
         <w:pStyle w:val="ListBullet"/>
       </w:pPr>
       <w:r>
-        <w:t>Histórico: Criação inicial do verbete.</w:t>
+        <w:t>Histórico: Ajuste ao modelo aprovado com títulos principais em japonês e camadas PT-Br/JP/leitura de apoio.</w:t>
       </w:r>
     </w:p>
     <w:p>
@@ -3703,7 +5159,7 @@
         <w:pStyle w:val="Heading2"/>
       </w:pPr>
       <w:r>
-        <w:t>Código</w:t>
+        <w:t>コード</w:t>
       </w:r>
     </w:p>
     <w:p>
@@ -3716,7 +5172,7 @@
         <w:pStyle w:val="Heading2"/>
       </w:pPr>
       <w:r>
-        <w:t>Categoria</w:t>
+        <w:t>カテゴリー</w:t>
       </w:r>
     </w:p>
     <w:p>
@@ -3729,7 +5185,7 @@
         <w:pStyle w:val="Heading2"/>
       </w:pPr>
       <w:r>
-        <w:t>Termo Japonês</w:t>
+        <w:t>日本語用語</w:t>
       </w:r>
     </w:p>
     <w:p>
@@ -3742,7 +5198,7 @@
         <w:pStyle w:val="Heading2"/>
       </w:pPr>
       <w:r>
-        <w:t>Tradução Português</w:t>
+        <w:t>ポルトガル語訳</w:t>
       </w:r>
     </w:p>
     <w:p>
@@ -3755,12 +5211,12 @@
         <w:pStyle w:val="Heading2"/>
       </w:pPr>
       <w:r>
-        <w:t>Definição Técnica</w:t>
-      </w:r>
-    </w:p>
-    <w:p>
-      <w:r>
-        <w:t>Valor pago pela seguradora ao segurado, beneficiário ou terceiro quando ocorre evento coberto pela apólice e são cumpridas as condições contratuais.</w:t>
+        <w:t>技術的定義</w:t>
+      </w:r>
+    </w:p>
+    <w:p>
+      <w:r>
+        <w:t>保険金とは、自動車保険の相談・契約・保険金請求または契約管理において確認すべき専門用語です。具体的な意味、適用範囲、必要書類、支払可否は、保険商品、契約条件、事故状況および保険会社の判断によって異なります。</w:t>
       </w:r>
     </w:p>
     <w:p>
@@ -3768,12 +5224,12 @@
         <w:pStyle w:val="Heading2"/>
       </w:pPr>
       <w:r>
-        <w:t>Explicação Simplificada</w:t>
-      </w:r>
-    </w:p>
-    <w:p>
-      <w:r>
-        <w:t>É o dinheiro que a seguradora paga quando acontece um sinistro coberto.</w:t>
+        <w:t>簡単な説明</w:t>
+      </w:r>
+    </w:p>
+    <w:p>
+      <w:r>
+        <w:t>お客様には、「Indenização do seguro」に関する内容を、契約内容、条件、必要書類に分けて確認することとして説明します。</w:t>
       </w:r>
     </w:p>
     <w:p>
@@ -3781,12 +5237,51 @@
         <w:pStyle w:val="Heading2"/>
       </w:pPr>
       <w:r>
-        <w:t>Como explicar ao cliente brasileiro</w:t>
-      </w:r>
-    </w:p>
-    <w:p>
-      <w:r>
-        <w:t>Indenização do seguro é o valor pago pela seguradora quando ocorre um acidente ou evento coberto. O pagamento depende da análise do caso, das coberturas contratadas, dos documentos apresentados e das condições da apólice.</w:t>
+        <w:t>ブラジル人顧客への説明方法</w:t>
+      </w:r>
+    </w:p>
+    <w:p>
+      <w:pPr>
+        <w:pStyle w:val="Heading3"/>
+      </w:pPr>
+      <w:r>
+        <w:t>PT-Br</w:t>
+      </w:r>
+    </w:p>
+    <w:p>
+      <w:r>
+        <w:t>Vamos confirmar indenização do seguro e explicar de forma simples, conforme o contrato.</w:t>
+      </w:r>
+    </w:p>
+    <w:p>
+      <w:pPr>
+        <w:pStyle w:val="Heading3"/>
+      </w:pPr>
+      <w:r>
+        <w:t>JP（ふりがな）</w:t>
+      </w:r>
+    </w:p>
+    <w:p>
+      <w:r>
+        <w:t>「Indenização do seguro」について、契約内容に沿って分かりやすく確認します。</w:t>
+      </w:r>
+    </w:p>
+    <w:p>
+      <w:r>
+        <w:t>ふりがな: 「インドエンイズアサォン ド セグーロ」について、けいやくないようにそって、わかりやすくかくにんします。</w:t>
+      </w:r>
+    </w:p>
+    <w:p>
+      <w:pPr>
+        <w:pStyle w:val="Heading3"/>
+      </w:pPr>
+      <w:r>
+        <w:t>Leitura de apoio para o corretor</w:t>
+      </w:r>
+    </w:p>
+    <w:p>
+      <w:r>
+        <w:t>ヴァモス コンフィルマール インドエンイズアサォン ド セグーロ イ エスプリカール ジ フォルマ シンプレス コンフォルミ オ コントラート</w:t>
       </w:r>
     </w:p>
     <w:p>
@@ -3794,7 +5289,7 @@
         <w:pStyle w:val="Heading2"/>
       </w:pPr>
       <w:r>
-        <w:t>Frases utilizadas</w:t>
+        <w:t>使用フレーズ</w:t>
       </w:r>
     </w:p>
     <w:p>
@@ -3810,7 +5305,7 @@
         <w:pStyle w:val="ListBullet"/>
       </w:pPr>
       <w:r>
-        <w:t>保険金は補償対象となる事故が発生した場合に支払われます。</w:t>
+        <w:t>保険金について確認しましょう。</w:t>
       </w:r>
     </w:p>
     <w:p>
@@ -3818,7 +5313,7 @@
         <w:pStyle w:val="ListBullet"/>
       </w:pPr>
       <w:r>
-        <w:t>お支払いには事故内容と契約条件の確認が必要です。</w:t>
+        <w:t>契約内容と必要書類を分けて確認します.</w:t>
       </w:r>
     </w:p>
     <w:p>
@@ -3834,7 +5329,12 @@
         <w:pStyle w:val="ListBullet"/>
       </w:pPr>
       <w:r>
-        <w:t>A indenização é paga quando ocorre um evento coberto pelo seguro.</w:t>
+        <w:t>Vamos confirmar indenização do seguro.</w:t>
+      </w:r>
+    </w:p>
+    <w:p>
+      <w:r>
+        <w:t xml:space="preserve">  - Leitura de apoio: ヴァモス コンフィルマール インドエンイズアサォン ド セグーロ</w:t>
       </w:r>
     </w:p>
     <w:p>
@@ -3842,7 +5342,12 @@
         <w:pStyle w:val="ListBullet"/>
       </w:pPr>
       <w:r>
-        <w:t>Para o pagamento, é necessário verificar o acidente e as condições do contrato.</w:t>
+        <w:t>Vou explicar de forma simples, conforme o contrato.</w:t>
+      </w:r>
+    </w:p>
+    <w:p>
+      <w:r>
+        <w:t xml:space="preserve">  - Leitura de apoio: ヴォウ エスプリカール ジ フォルマ シンプレス コンフォルミ オ コントラート</w:t>
       </w:r>
     </w:p>
     <w:p>
@@ -3850,7 +5355,7 @@
         <w:pStyle w:val="Heading2"/>
       </w:pPr>
       <w:r>
-        <w:t>Perguntas frequentes</w:t>
+        <w:t>よくある質問</w:t>
       </w:r>
     </w:p>
     <w:p>
@@ -3866,7 +5371,7 @@
         <w:pStyle w:val="Heading2"/>
       </w:pPr>
       <w:r>
-        <w:t>Termos relacionados</w:t>
+        <w:t>関連用語</w:t>
       </w:r>
     </w:p>
     <w:p>
@@ -3898,7 +5403,7 @@
         <w:pStyle w:val="Heading2"/>
       </w:pPr>
       <w:r>
-        <w:t>Referências cruzadas</w:t>
+        <w:t>相互参照</w:t>
       </w:r>
     </w:p>
     <w:p>
@@ -3930,7 +5435,7 @@
         <w:pStyle w:val="Heading2"/>
       </w:pPr>
       <w:r>
-        <w:t>Referências</w:t>
+        <w:t>参考資料</w:t>
       </w:r>
     </w:p>
     <w:p>
@@ -3954,7 +5459,7 @@
         <w:pStyle w:val="Heading2"/>
       </w:pPr>
       <w:r>
-        <w:t>Tags</w:t>
+        <w:t>タグ</w:t>
       </w:r>
     </w:p>
     <w:p>
@@ -3994,7 +5499,7 @@
         <w:pStyle w:val="Heading2"/>
       </w:pPr>
       <w:r>
-        <w:t>Veja também</w:t>
+        <w:t>関連項目</w:t>
       </w:r>
     </w:p>
     <w:p>
@@ -4026,39 +5531,152 @@
         <w:pStyle w:val="Heading2"/>
       </w:pPr>
       <w:r>
-        <w:t>Histórico de revisão</w:t>
-      </w:r>
-    </w:p>
-    <w:p>
-      <w:r>
-        <w:rPr>
-          <w:rFonts w:ascii="Courier New" w:hAnsi="Courier New"/>
-          <w:sz w:val="17"/>
-        </w:rPr>
-        <w:t>| Data | Versão | Autor | Alteração |</w:t>
-      </w:r>
-    </w:p>
-    <w:p>
-      <w:r>
-        <w:rPr>
-          <w:rFonts w:ascii="Courier New" w:hAnsi="Courier New"/>
-          <w:sz w:val="17"/>
-        </w:rPr>
-        <w:t>| --- | --- | --- | --- |</w:t>
-      </w:r>
-    </w:p>
-    <w:p>
-      <w:r>
-        <w:rPr>
-          <w:rFonts w:ascii="Courier New" w:hAnsi="Courier New"/>
-          <w:sz w:val="17"/>
-        </w:rPr>
-        <w:t>| 2026-06-25 | 0.1 | JP-BR Insurance Knowledge Base | Criação inicial. |</w:t>
-      </w:r>
-    </w:p>
+        <w:t>改訂履歴</w:t>
+      </w:r>
+    </w:p>
+    <w:tbl>
+      <w:tblPr>
+        <w:tblStyle w:val="TableGrid"/>
+        <w:tblW w:type="auto" w:w="0"/>
+        <w:tblLook w:firstColumn="1" w:firstRow="1" w:lastColumn="0" w:lastRow="0" w:noHBand="0" w:noVBand="1" w:val="04A0"/>
+      </w:tblPr>
+      <w:tblGrid>
+        <w:gridCol w:w="2520"/>
+        <w:gridCol w:w="2520"/>
+        <w:gridCol w:w="2520"/>
+        <w:gridCol w:w="2520"/>
+      </w:tblGrid>
+      <w:tr>
+        <w:tc>
+          <w:tcPr>
+            <w:tcW w:type="dxa" w:w="2520"/>
+          </w:tcPr>
+          <w:p>
+            <w:r>
+              <w:t>Data</w:t>
+            </w:r>
+          </w:p>
+        </w:tc>
+        <w:tc>
+          <w:tcPr>
+            <w:tcW w:type="dxa" w:w="2520"/>
+          </w:tcPr>
+          <w:p>
+            <w:r>
+              <w:t>Versão</w:t>
+            </w:r>
+          </w:p>
+        </w:tc>
+        <w:tc>
+          <w:tcPr>
+            <w:tcW w:type="dxa" w:w="2520"/>
+          </w:tcPr>
+          <w:p>
+            <w:r>
+              <w:t>Autor</w:t>
+            </w:r>
+          </w:p>
+        </w:tc>
+        <w:tc>
+          <w:tcPr>
+            <w:tcW w:type="dxa" w:w="2520"/>
+          </w:tcPr>
+          <w:p>
+            <w:r>
+              <w:t>Alteração</w:t>
+            </w:r>
+          </w:p>
+        </w:tc>
+      </w:tr>
+      <w:tr>
+        <w:tc>
+          <w:tcPr>
+            <w:tcW w:type="dxa" w:w="2520"/>
+          </w:tcPr>
+          <w:p>
+            <w:r>
+              <w:t>2026-06-25</w:t>
+            </w:r>
+          </w:p>
+        </w:tc>
+        <w:tc>
+          <w:tcPr>
+            <w:tcW w:type="dxa" w:w="2520"/>
+          </w:tcPr>
+          <w:p>
+            <w:r>
+              <w:t>0.1</w:t>
+            </w:r>
+          </w:p>
+        </w:tc>
+        <w:tc>
+          <w:tcPr>
+            <w:tcW w:type="dxa" w:w="2520"/>
+          </w:tcPr>
+          <w:p>
+            <w:r>
+              <w:t>JP-BR Insurance Knowledge Base</w:t>
+            </w:r>
+          </w:p>
+        </w:tc>
+        <w:tc>
+          <w:tcPr>
+            <w:tcW w:type="dxa" w:w="2520"/>
+          </w:tcPr>
+          <w:p>
+            <w:r>
+              <w:t>Criação inicial.</w:t>
+            </w:r>
+          </w:p>
+        </w:tc>
+      </w:tr>
+      <w:tr>
+        <w:tc>
+          <w:tcPr>
+            <w:tcW w:type="dxa" w:w="2520"/>
+          </w:tcPr>
+          <w:p>
+            <w:r>
+              <w:t>2026-06-27</w:t>
+            </w:r>
+          </w:p>
+        </w:tc>
+        <w:tc>
+          <w:tcPr>
+            <w:tcW w:type="dxa" w:w="2520"/>
+          </w:tcPr>
+          <w:p>
+            <w:r>
+              <w:t>0.2</w:t>
+            </w:r>
+          </w:p>
+        </w:tc>
+        <w:tc>
+          <w:tcPr>
+            <w:tcW w:type="dxa" w:w="2520"/>
+          </w:tcPr>
+          <w:p>
+            <w:r>
+              <w:t>JP-BR Insurance Knowledge Base</w:t>
+            </w:r>
+          </w:p>
+        </w:tc>
+        <w:tc>
+          <w:tcPr>
+            <w:tcW w:type="dxa" w:w="2520"/>
+          </w:tcPr>
+          <w:p>
+            <w:r>
+              <w:t>Ajuste ao modelo aprovado com PT-Br, JP（ふりがな） e leitura de apoio para o corretor.</w:t>
+            </w:r>
+          </w:p>
+        </w:tc>
+      </w:tr>
+    </w:tbl>
+    <w:p/>
     <w:sectPr>
       <w:pgSz w:w="12240" w:h="15840"/>
-      <w:pgMar w:top="1080" w:right="1224" w:bottom="1080" w:left="1224" w:header="720" w:footer="720" w:gutter="0"/>
+      <w:pgMar w:top="1008" w:right="1080" w:bottom="1008" w:left="1080" w:header="720" w:footer="720" w:gutter="0"/>
       <w:cols w:space="720"/>
       <w:docGrid w:linePitch="360"/>
     </w:sectPr>
@@ -4430,8 +6048,8 @@
     <w:qFormat/>
     <w:rsid w:val="00FC693F"/>
     <w:rPr>
-      <w:rFonts w:ascii="Arial" w:hAnsi="Arial"/>
-      <w:sz w:val="20"/>
+      <w:rFonts w:ascii="Arial Unicode MS" w:hAnsi="Arial Unicode MS"/>
+      <w:sz w:val="21"/>
     </w:rPr>
   </w:style>
   <w:style w:type="paragraph" w:styleId="Header">
@@ -4493,11 +6111,11 @@
       <w:outlineLvl w:val="0"/>
     </w:pPr>
     <w:rPr>
-      <w:rFonts w:asciiTheme="majorHAnsi" w:eastAsiaTheme="majorEastAsia" w:hAnsiTheme="majorHAnsi" w:cstheme="majorBidi"/>
+      <w:rFonts w:asciiTheme="majorHAnsi" w:eastAsiaTheme="majorEastAsia" w:hAnsiTheme="majorHAnsi" w:cstheme="majorBidi" w:ascii="Arial Unicode MS" w:hAnsi="Arial Unicode MS"/>
       <w:b/>
       <w:bCs/>
       <w:color w:val="365F91" w:themeColor="accent1" w:themeShade="BF"/>
-      <w:sz w:val="28"/>
+      <w:sz w:val="36"/>
       <w:szCs w:val="28"/>
     </w:rPr>
   </w:style>
@@ -4517,11 +6135,11 @@
       <w:outlineLvl w:val="1"/>
     </w:pPr>
     <w:rPr>
-      <w:rFonts w:asciiTheme="majorHAnsi" w:eastAsiaTheme="majorEastAsia" w:hAnsiTheme="majorHAnsi" w:cstheme="majorBidi"/>
+      <w:rFonts w:asciiTheme="majorHAnsi" w:eastAsiaTheme="majorEastAsia" w:hAnsiTheme="majorHAnsi" w:cstheme="majorBidi" w:ascii="Arial Unicode MS" w:hAnsi="Arial Unicode MS"/>
       <w:b/>
       <w:bCs/>
       <w:color w:val="4F81BD" w:themeColor="accent1"/>
-      <w:sz w:val="26"/>
+      <w:sz w:val="28"/>
       <w:szCs w:val="26"/>
     </w:rPr>
   </w:style>
@@ -4541,10 +6159,11 @@
       <w:outlineLvl w:val="2"/>
     </w:pPr>
     <w:rPr>
-      <w:rFonts w:asciiTheme="majorHAnsi" w:eastAsiaTheme="majorEastAsia" w:hAnsiTheme="majorHAnsi" w:cstheme="majorBidi"/>
+      <w:rFonts w:asciiTheme="majorHAnsi" w:eastAsiaTheme="majorEastAsia" w:hAnsiTheme="majorHAnsi" w:cstheme="majorBidi" w:ascii="Arial Unicode MS" w:hAnsi="Arial Unicode MS"/>
       <w:b/>
       <w:bCs/>
       <w:color w:val="4F81BD" w:themeColor="accent1"/>
+      <w:sz w:val="24"/>
     </w:rPr>
   </w:style>
   <w:style w:type="paragraph" w:styleId="Heading4">

</xml_diff>